<commit_message>
minor instruction file adjustments; set up new workshop docx files for the group meetings; todo change
</commit_message>
<xml_diff>
--- a/20_experiments/80_workshop/e1/s2/workshop1-2.docx
+++ b/20_experiments/80_workshop/e1/s2/workshop1-2.docx
@@ -220,7 +220,7 @@
           <w:sz w:val="22"/>
           <w:szCs w:val="22"/>
         </w:rPr>
-        <w:t>, die folgende Kategorien umfasst (jeweils 1-5 Punkte). Bestimmte Kategorien fokussieren sich auf die Bewertung der Fragen selbst, andere auf die Bewertung der Antworten.</w:t>
+        <w:t>, die folgende Kategorien umfasst (jeweils 1-5 Punkte). Bestimmte Kategorien fokussieren sich auf die Bewertung der Fragen selbst, andere auf die Bewertung der Antworten. Beide Bestandteile sollen unmittelbar nach dem Lesen des jeweiligen Teils bewertet werden.</w:t>
       </w:r>
     </w:p>
     <w:p>
@@ -836,7 +836,7 @@
           <w:sz w:val="22"/>
           <w:szCs w:val="22"/>
         </w:rPr>
-        <w:t>Öffnen Sie die entsprechende Fragendatei und lesen Sie die Frage sorgfältig</w:t>
+        <w:t>Öffnen Sie die entsprechende Fragendatei und schauen Sie sich das Lernziel für diese Frage an</w:t>
       </w:r>
     </w:p>
     <w:p>
@@ -856,7 +856,7 @@
           <w:sz w:val="22"/>
           <w:szCs w:val="22"/>
         </w:rPr>
-        <w:t>Prüfen Sie den Quelltext (direkt unter der Frage angegeben)</w:t>
+        <w:t>Lesen Sie die Frage sorgfältig. Lassen Sie dabei die Antwort noch außer Acht</w:t>
       </w:r>
     </w:p>
     <w:p>
@@ -876,7 +876,7 @@
           <w:sz w:val="22"/>
           <w:szCs w:val="22"/>
         </w:rPr>
-        <w:t>Bewerten Sie nach den 6 Kategorien der Rubrik für die Frage</w:t>
+        <w:t>Prüfen Sie den Quelltext am unteren Ende der Datei</w:t>
       </w:r>
     </w:p>
     <w:p>
@@ -896,7 +896,7 @@
           <w:sz w:val="22"/>
           <w:szCs w:val="22"/>
         </w:rPr>
-        <w:t>Bewerten Sie nach den 3 Kategorien der Rubrik für die Antworten</w:t>
+        <w:t>Bewerten Sie nach den 6 Kategorien der Rubrik für die Frage und notieren Sie Ihre Bewertungen in die CSV</w:t>
       </w:r>
     </w:p>
     <w:p>
@@ -916,7 +916,7 @@
           <w:sz w:val="22"/>
           <w:szCs w:val="22"/>
         </w:rPr>
-        <w:t>Notieren Sie Ihre Bewertungen entsprechend in die CSV</w:t>
+        <w:t>Lesen SIe nun die Antwort(en) zur Frage sorgfältig durch</w:t>
       </w:r>
     </w:p>
     <w:p>
@@ -926,29 +926,17 @@
           <w:ilvl w:val="1"/>
           <w:numId w:val="1"/>
         </w:numPr>
-        <w:rPr/>
-      </w:pPr>
-      <w:r>
-        <w:rPr>
-          <w:sz w:val="22"/>
-          <w:szCs w:val="22"/>
-        </w:rPr>
-        <w:t xml:space="preserve">Notieren Sie gegebenenfalls problematische Antworten/Antwortoptionen in </w:t>
-      </w:r>
-      <w:r>
-        <w:rPr>
-          <w:rStyle w:val="VerbatimChar"/>
-          <w:sz w:val="22"/>
-          <w:szCs w:val="22"/>
-        </w:rPr>
-        <w:t>answer_problems</w:t>
-      </w:r>
-      <w:r>
-        <w:rPr>
-          <w:sz w:val="22"/>
-          <w:szCs w:val="22"/>
-        </w:rPr>
-        <w:t>, und warum diese problematisch sind</w:t>
+        <w:rPr>
+          <w:sz w:val="22"/>
+          <w:szCs w:val="22"/>
+        </w:rPr>
+      </w:pPr>
+      <w:r>
+        <w:rPr>
+          <w:sz w:val="22"/>
+          <w:szCs w:val="22"/>
+        </w:rPr>
+        <w:t>Bewerten Sie nach den 3 Kategorien der Rubrik für die Antwort(en) und notieren Sie Ihre Bewertungen in die CSV</w:t>
       </w:r>
     </w:p>
     <w:p>
@@ -965,6 +953,38 @@
           <w:sz w:val="22"/>
           <w:szCs w:val="22"/>
         </w:rPr>
+        <w:t xml:space="preserve">Notieren Sie gegebenenfalls problematische Antworten/Antwortoptionen in </w:t>
+      </w:r>
+      <w:r>
+        <w:rPr>
+          <w:rStyle w:val="VerbatimChar"/>
+          <w:sz w:val="22"/>
+          <w:szCs w:val="22"/>
+        </w:rPr>
+        <w:t>answer_problems</w:t>
+      </w:r>
+      <w:r>
+        <w:rPr>
+          <w:sz w:val="22"/>
+          <w:szCs w:val="22"/>
+        </w:rPr>
+        <w:t>, und warum diese problematisch sind</w:t>
+      </w:r>
+    </w:p>
+    <w:p>
+      <w:pPr>
+        <w:pStyle w:val="Compact"/>
+        <w:numPr>
+          <w:ilvl w:val="1"/>
+          <w:numId w:val="1"/>
+        </w:numPr>
+        <w:rPr/>
+      </w:pPr>
+      <w:r>
+        <w:rPr>
+          <w:sz w:val="22"/>
+          <w:szCs w:val="22"/>
+        </w:rPr>
         <w:t xml:space="preserve">Ergänzen Sie bei Bedarf weitere Kommentare in </w:t>
       </w:r>
       <w:r>
@@ -982,16 +1002,81 @@
         <w:rPr>
           <w:sz w:val="22"/>
           <w:szCs w:val="22"/>
+        </w:rPr>
+      </w:pPr>
+      <w:bookmarkStart w:id="3" w:name="dankbarkeit"/>
+      <w:bookmarkStart w:id="4" w:name="Xdef6236bb5f38117b519091ae3187e154a68fb8"/>
+      <w:r>
+        <w:rPr>
+          <w:sz w:val="22"/>
+          <w:szCs w:val="22"/>
+        </w:rPr>
+        <w:t>Vielen Dank für Ihre Unterstützung bei der Evaluation! Ihre Einschätzungen sind wertvoll für die Forschung.</w:t>
+      </w:r>
+      <w:bookmarkEnd w:id="3"/>
+      <w:bookmarkEnd w:id="4"/>
+    </w:p>
+    <w:p>
+      <w:pPr>
+        <w:pStyle w:val="Heading1"/>
+        <w:rPr/>
+      </w:pPr>
+      <w:r>
+        <w:rPr/>
+        <w:t>Bewertungsrubrik für LLM-generierte Fragen</w:t>
+      </w:r>
+    </w:p>
+    <w:p>
+      <w:pPr>
+        <w:pStyle w:val="Heading2"/>
+        <w:rPr/>
+      </w:pPr>
+      <w:r>
+        <w:rPr/>
+        <w:t>Relevanz/Relevance</w:t>
+      </w:r>
+    </w:p>
+    <w:p>
+      <w:pPr>
+        <w:pStyle w:val="FirstParagraph"/>
+        <w:rPr>
+          <w:sz w:val="21"/>
+          <w:szCs w:val="21"/>
         </w:rPr>
       </w:pPr>
       <w:r>
         <w:rPr>
           <w:b/>
           <w:bCs/>
-          <w:sz w:val="22"/>
-          <w:szCs w:val="22"/>
-        </w:rPr>
-        <w:t>Bewertungsfokus:</w:t>
+          <w:sz w:val="21"/>
+          <w:szCs w:val="21"/>
+        </w:rPr>
+        <w:t>Fragestellung:</w:t>
+      </w:r>
+      <w:r>
+        <w:rPr>
+          <w:sz w:val="21"/>
+          <w:szCs w:val="21"/>
+        </w:rPr>
+        <w:t xml:space="preserve"> Wie gut bezieht sich die Frage aus Dozierendenperspektive auf zentrale Fachkonzepte, Themen und Fachbegriffe des bereitgestellten Textes?</w:t>
+      </w:r>
+    </w:p>
+    <w:p>
+      <w:pPr>
+        <w:pStyle w:val="BodyText"/>
+        <w:rPr>
+          <w:sz w:val="21"/>
+          <w:szCs w:val="21"/>
+        </w:rPr>
+      </w:pPr>
+      <w:r>
+        <w:rPr>
+          <w:i/>
+          <w:iCs/>
+          <w:sz w:val="21"/>
+          <w:szCs w:val="21"/>
+        </w:rPr>
+        <w:t>Hinweis: Hier geht es nicht darum, ob der Inhalt korrekt abgebildet wird, sondern nur um den thematischen Bezug.</w:t>
       </w:r>
     </w:p>
     <w:p>
@@ -999,98 +1084,8 @@
         <w:pStyle w:val="Compact"/>
         <w:numPr>
           <w:ilvl w:val="0"/>
-          <w:numId w:val="1"/>
-        </w:numPr>
-        <w:rPr>
-          <w:sz w:val="22"/>
-          <w:szCs w:val="22"/>
-        </w:rPr>
-      </w:pPr>
-      <w:r>
-        <w:rPr>
-          <w:sz w:val="22"/>
-          <w:szCs w:val="22"/>
-        </w:rPr>
-        <w:t>Ist die Frage fachlich korrekt bezogen auf den Layer-Text?</w:t>
-      </w:r>
-    </w:p>
-    <w:p>
-      <w:pPr>
-        <w:pStyle w:val="Compact"/>
-        <w:numPr>
-          <w:ilvl w:val="0"/>
-          <w:numId w:val="1"/>
-        </w:numPr>
-        <w:rPr>
-          <w:sz w:val="22"/>
-          <w:szCs w:val="22"/>
-        </w:rPr>
-      </w:pPr>
-      <w:bookmarkStart w:id="3" w:name="anleitung-für-experten"/>
-      <w:bookmarkStart w:id="4" w:name="schritt-3-bewertung-durchführen"/>
-      <w:r>
-        <w:rPr>
-          <w:sz w:val="22"/>
-          <w:szCs w:val="22"/>
-        </w:rPr>
-        <w:t>Sind alle im Text enthaltenen Informationen richtig wiedergegeben?</w:t>
-      </w:r>
-      <w:bookmarkEnd w:id="3"/>
-      <w:bookmarkEnd w:id="4"/>
-    </w:p>
-    <w:p>
-      <w:pPr>
-        <w:pStyle w:val="Heading2"/>
-        <w:rPr/>
-      </w:pPr>
-      <w:r>
-        <w:rPr/>
-        <w:t>Dankbarkeit</w:t>
-      </w:r>
-    </w:p>
-    <w:p>
-      <w:pPr>
-        <w:pStyle w:val="FirstParagraph"/>
-        <w:rPr>
-          <w:sz w:val="22"/>
-          <w:szCs w:val="22"/>
-        </w:rPr>
-      </w:pPr>
-      <w:bookmarkStart w:id="5" w:name="Xdef6236bb5f38117b519091ae3187e154a68fb8"/>
-      <w:bookmarkStart w:id="6" w:name="dankbarkeit"/>
-      <w:r>
-        <w:rPr>
-          <w:sz w:val="22"/>
-          <w:szCs w:val="22"/>
-        </w:rPr>
-        <w:t>Vielen Dank für Ihre Unterstützung bei der Evaluation! Ihre Einschätzungen sind wertvoll für die Forschung.</w:t>
-      </w:r>
-      <w:bookmarkEnd w:id="5"/>
-      <w:bookmarkEnd w:id="6"/>
-    </w:p>
-    <w:p>
-      <w:pPr>
-        <w:pStyle w:val="Heading1"/>
-        <w:rPr/>
-      </w:pPr>
-      <w:r>
-        <w:rPr/>
-        <w:t>Bewertungsrubrik für LLM-generierte Fragen</w:t>
-      </w:r>
-    </w:p>
-    <w:p>
-      <w:pPr>
-        <w:pStyle w:val="Heading2"/>
-        <w:rPr/>
-      </w:pPr>
-      <w:r>
-        <w:rPr/>
-        <w:t>Relevanz/Relevance</w:t>
-      </w:r>
-    </w:p>
-    <w:p>
-      <w:pPr>
-        <w:pStyle w:val="FirstParagraph"/>
+          <w:numId w:val="2"/>
+        </w:numPr>
         <w:rPr>
           <w:sz w:val="21"/>
           <w:szCs w:val="21"/>
@@ -1103,6 +1098,199 @@
           <w:sz w:val="21"/>
           <w:szCs w:val="21"/>
         </w:rPr>
+        <w:t>5 - Überaus relevant:</w:t>
+      </w:r>
+      <w:r>
+        <w:rPr>
+          <w:sz w:val="21"/>
+          <w:szCs w:val="21"/>
+        </w:rPr>
+        <w:t xml:space="preserve"> Bezieht sich auf zentrale Themen und korrekte Fachbegriffe</w:t>
+      </w:r>
+    </w:p>
+    <w:p>
+      <w:pPr>
+        <w:pStyle w:val="Compact"/>
+        <w:numPr>
+          <w:ilvl w:val="1"/>
+          <w:numId w:val="2"/>
+        </w:numPr>
+        <w:rPr>
+          <w:sz w:val="21"/>
+          <w:szCs w:val="21"/>
+        </w:rPr>
+      </w:pPr>
+      <w:r>
+        <w:rPr>
+          <w:sz w:val="21"/>
+          <w:szCs w:val="21"/>
+        </w:rPr>
+        <w:t>Bsp.: “Welche Kernaufgaben erfüllt der Data Link Layer und worin unterscheiden sich diese hinsichtlich ihrer Zielsetzung?”</w:t>
+      </w:r>
+    </w:p>
+    <w:p>
+      <w:pPr>
+        <w:pStyle w:val="Compact"/>
+        <w:numPr>
+          <w:ilvl w:val="0"/>
+          <w:numId w:val="2"/>
+        </w:numPr>
+        <w:rPr>
+          <w:sz w:val="21"/>
+          <w:szCs w:val="21"/>
+        </w:rPr>
+      </w:pPr>
+      <w:r>
+        <w:rPr>
+          <w:b/>
+          <w:bCs/>
+          <w:sz w:val="21"/>
+          <w:szCs w:val="21"/>
+        </w:rPr>
+        <w:t>4 - Relevant:</w:t>
+      </w:r>
+      <w:r>
+        <w:rPr>
+          <w:sz w:val="21"/>
+          <w:szCs w:val="21"/>
+        </w:rPr>
+        <w:t xml:space="preserve"> Bezieht sich auf wichtige Fachkonzepte des Textes</w:t>
+      </w:r>
+    </w:p>
+    <w:p>
+      <w:pPr>
+        <w:pStyle w:val="Compact"/>
+        <w:numPr>
+          <w:ilvl w:val="0"/>
+          <w:numId w:val="2"/>
+        </w:numPr>
+        <w:rPr>
+          <w:sz w:val="21"/>
+          <w:szCs w:val="21"/>
+        </w:rPr>
+      </w:pPr>
+      <w:r>
+        <w:rPr>
+          <w:b/>
+          <w:bCs/>
+          <w:sz w:val="21"/>
+          <w:szCs w:val="21"/>
+        </w:rPr>
+        <w:t>3 - Mäßig relevant:</w:t>
+      </w:r>
+      <w:r>
+        <w:rPr>
+          <w:sz w:val="21"/>
+          <w:szCs w:val="21"/>
+        </w:rPr>
+        <w:t xml:space="preserve"> Behandelt eher nebensächliche Aspekte oder Randthemen des Textes</w:t>
+      </w:r>
+    </w:p>
+    <w:p>
+      <w:pPr>
+        <w:pStyle w:val="Compact"/>
+        <w:numPr>
+          <w:ilvl w:val="0"/>
+          <w:numId w:val="2"/>
+        </w:numPr>
+        <w:rPr>
+          <w:sz w:val="21"/>
+          <w:szCs w:val="21"/>
+        </w:rPr>
+      </w:pPr>
+      <w:r>
+        <w:rPr>
+          <w:b/>
+          <w:bCs/>
+          <w:sz w:val="21"/>
+          <w:szCs w:val="21"/>
+        </w:rPr>
+        <w:t>2 - Weniger relevant:</w:t>
+      </w:r>
+      <w:r>
+        <w:rPr>
+          <w:sz w:val="21"/>
+          <w:szCs w:val="21"/>
+        </w:rPr>
+        <w:t xml:space="preserve"> Nur oberflächlicher Bezug zu Fachkonzepten</w:t>
+      </w:r>
+    </w:p>
+    <w:p>
+      <w:pPr>
+        <w:pStyle w:val="Compact"/>
+        <w:numPr>
+          <w:ilvl w:val="0"/>
+          <w:numId w:val="2"/>
+        </w:numPr>
+        <w:rPr>
+          <w:sz w:val="21"/>
+          <w:szCs w:val="21"/>
+        </w:rPr>
+      </w:pPr>
+      <w:r>
+        <w:rPr>
+          <w:b/>
+          <w:bCs/>
+          <w:sz w:val="21"/>
+          <w:szCs w:val="21"/>
+        </w:rPr>
+        <w:t>1 - Nicht relevant:</w:t>
+      </w:r>
+      <w:r>
+        <w:rPr>
+          <w:sz w:val="21"/>
+          <w:szCs w:val="21"/>
+        </w:rPr>
+        <w:t xml:space="preserve"> Kein Bezug zu den im Text behandelten Fachkonzepten</w:t>
+      </w:r>
+    </w:p>
+    <w:p>
+      <w:pPr>
+        <w:pStyle w:val="Compact"/>
+        <w:numPr>
+          <w:ilvl w:val="1"/>
+          <w:numId w:val="2"/>
+        </w:numPr>
+        <w:rPr>
+          <w:sz w:val="21"/>
+          <w:szCs w:val="21"/>
+        </w:rPr>
+      </w:pPr>
+      <w:bookmarkStart w:id="5" w:name="relevanzrelevance"/>
+      <w:r>
+        <w:rPr>
+          <w:sz w:val="21"/>
+          <w:szCs w:val="21"/>
+        </w:rPr>
+        <w:t>Bsp.: “Welche Programmiersprache wird am häufigsten für die Implementierung von Netzwerkprotokollen verwendet?”</w:t>
+      </w:r>
+      <w:bookmarkEnd w:id="5"/>
+    </w:p>
+    <w:p>
+      <w:pPr>
+        <w:pStyle w:val="Heading2"/>
+        <w:rPr/>
+      </w:pPr>
+      <w:r>
+        <w:rPr/>
+        <w:t>Klarheit/Clarity</w:t>
+      </w:r>
+    </w:p>
+    <w:p>
+      <w:pPr>
+        <w:pStyle w:val="FirstParagraph"/>
+        <w:rPr>
+          <w:sz w:val="21"/>
+          <w:szCs w:val="21"/>
+        </w:rPr>
+      </w:pPr>
+      <w:r>
+        <w:rPr>
+          <w:b/>
+          <w:bCs/>
+          <w:sz w:val="21"/>
+          <w:szCs w:val="21"/>
+        </w:rPr>
         <w:t>Fragestellung:</w:t>
       </w:r>
       <w:r>
@@ -1110,7 +1298,7 @@
           <w:sz w:val="21"/>
           <w:szCs w:val="21"/>
         </w:rPr>
-        <w:t xml:space="preserve"> Wie gut bezieht sich die Frage aus Dozierendenperspektive auf zentrale Fachkonzepte, Themen und Fachbegriffe des bereitgestellten Textes?</w:t>
+        <w:t xml:space="preserve"> Wie präzise und inhaltlich eindeutig ist die Frage aus Dozierendenperspektive formuliert? Bewerten Sie auch die inhaltliche Klarheit im Nachhinein für die Beantwortung der Frage.</w:t>
       </w:r>
     </w:p>
     <w:p>
@@ -1128,7 +1316,7 @@
           <w:sz w:val="21"/>
           <w:szCs w:val="21"/>
         </w:rPr>
-        <w:t>Hinweis: Hier geht es nicht darum, ob der Inhalt korrekt abgebildet wird, sondern nur um den thematischen Bezug.</w:t>
+        <w:t>Hinweis: Hier geht es um inhaltliche Verständlichkeit und Eindeutigkeit, nicht um sprachliche Formulierungen.</w:t>
       </w:r>
     </w:p>
     <w:p>
@@ -1136,7 +1324,7 @@
         <w:pStyle w:val="Compact"/>
         <w:numPr>
           <w:ilvl w:val="0"/>
-          <w:numId w:val="4"/>
+          <w:numId w:val="2"/>
         </w:numPr>
         <w:rPr>
           <w:sz w:val="21"/>
@@ -1150,14 +1338,14 @@
           <w:sz w:val="21"/>
           <w:szCs w:val="21"/>
         </w:rPr>
-        <w:t>5 - Überaus relevant:</w:t>
-      </w:r>
-      <w:r>
-        <w:rPr>
-          <w:sz w:val="21"/>
-          <w:szCs w:val="21"/>
-        </w:rPr>
-        <w:t xml:space="preserve"> Bezieht sich auf zentrale Themen und korrekte Fachbegriffe</w:t>
+        <w:t>5 - Sehr klar:</w:t>
+      </w:r>
+      <w:r>
+        <w:rPr>
+          <w:sz w:val="21"/>
+          <w:szCs w:val="21"/>
+        </w:rPr>
+        <w:t xml:space="preserve"> Inhaltlich präzise und eindeutig formuliert, keine Mehrdeutigkeiten</w:t>
       </w:r>
     </w:p>
     <w:p>
@@ -1165,19 +1353,19 @@
         <w:pStyle w:val="Compact"/>
         <w:numPr>
           <w:ilvl w:val="1"/>
-          <w:numId w:val="4"/>
-        </w:numPr>
-        <w:rPr>
-          <w:sz w:val="21"/>
-          <w:szCs w:val="21"/>
-        </w:rPr>
-      </w:pPr>
-      <w:r>
-        <w:rPr>
-          <w:sz w:val="21"/>
-          <w:szCs w:val="21"/>
-        </w:rPr>
-        <w:t>Bsp.: “Welche Kernaufgaben erfüllt der Data Link Layer und worin unterscheiden sich diese hinsichtlich ihrer Zielsetzung?”</w:t>
+          <w:numId w:val="2"/>
+        </w:numPr>
+        <w:rPr>
+          <w:sz w:val="21"/>
+          <w:szCs w:val="21"/>
+        </w:rPr>
+      </w:pPr>
+      <w:r>
+        <w:rPr>
+          <w:sz w:val="21"/>
+          <w:szCs w:val="21"/>
+        </w:rPr>
+        <w:t>Bsp.: “Nennen Sie die Kernaufgaben des Session Layer und erläutern Sie jeweils deren Funktion.”</w:t>
       </w:r>
     </w:p>
     <w:p>
@@ -1185,7 +1373,7 @@
         <w:pStyle w:val="Compact"/>
         <w:numPr>
           <w:ilvl w:val="0"/>
-          <w:numId w:val="4"/>
+          <w:numId w:val="2"/>
         </w:numPr>
         <w:rPr>
           <w:sz w:val="21"/>
@@ -1199,14 +1387,14 @@
           <w:sz w:val="21"/>
           <w:szCs w:val="21"/>
         </w:rPr>
-        <w:t>4 - Relevant:</w:t>
-      </w:r>
-      <w:r>
-        <w:rPr>
-          <w:sz w:val="21"/>
-          <w:szCs w:val="21"/>
-        </w:rPr>
-        <w:t xml:space="preserve"> Bezieht sich auf wichtige Fachkonzepte des Textes</w:t>
+        <w:t>4 - Klar:</w:t>
+      </w:r>
+      <w:r>
+        <w:rPr>
+          <w:sz w:val="21"/>
+          <w:szCs w:val="21"/>
+        </w:rPr>
+        <w:t xml:space="preserve"> Inhaltlich verständlich mit minimalen Unklarheiten</w:t>
       </w:r>
     </w:p>
     <w:p>
@@ -1214,7 +1402,7 @@
         <w:pStyle w:val="Compact"/>
         <w:numPr>
           <w:ilvl w:val="0"/>
-          <w:numId w:val="4"/>
+          <w:numId w:val="2"/>
         </w:numPr>
         <w:rPr>
           <w:sz w:val="21"/>
@@ -1228,14 +1416,14 @@
           <w:sz w:val="21"/>
           <w:szCs w:val="21"/>
         </w:rPr>
-        <w:t>3 - Mäßig relevant:</w:t>
-      </w:r>
-      <w:r>
-        <w:rPr>
-          <w:sz w:val="21"/>
-          <w:szCs w:val="21"/>
-        </w:rPr>
-        <w:t xml:space="preserve"> Behandelt eher nebensächliche Aspekte oder Randthemen des Textes</w:t>
+        <w:t>3 - Mäßig klar:</w:t>
+      </w:r>
+      <w:r>
+        <w:rPr>
+          <w:sz w:val="21"/>
+          <w:szCs w:val="21"/>
+        </w:rPr>
+        <w:t xml:space="preserve"> Enthält einige inhaltlich unklare Formulierungen</w:t>
       </w:r>
     </w:p>
     <w:p>
@@ -1243,7 +1431,7 @@
         <w:pStyle w:val="Compact"/>
         <w:numPr>
           <w:ilvl w:val="0"/>
-          <w:numId w:val="4"/>
+          <w:numId w:val="2"/>
         </w:numPr>
         <w:rPr>
           <w:sz w:val="21"/>
@@ -1257,14 +1445,14 @@
           <w:sz w:val="21"/>
           <w:szCs w:val="21"/>
         </w:rPr>
-        <w:t>2 - Weniger relevant:</w:t>
-      </w:r>
-      <w:r>
-        <w:rPr>
-          <w:sz w:val="21"/>
-          <w:szCs w:val="21"/>
-        </w:rPr>
-        <w:t xml:space="preserve"> Nur oberflächlicher Bezug zu Fachkonzepten</w:t>
+        <w:t>2 - Unklar:</w:t>
+      </w:r>
+      <w:r>
+        <w:rPr>
+          <w:sz w:val="21"/>
+          <w:szCs w:val="21"/>
+        </w:rPr>
+        <w:t xml:space="preserve"> Enthält mehrere mehrdeutige oder verwirrende inhaltliche Elemente</w:t>
       </w:r>
     </w:p>
     <w:p>
@@ -1272,7 +1460,7 @@
         <w:pStyle w:val="Compact"/>
         <w:numPr>
           <w:ilvl w:val="0"/>
-          <w:numId w:val="4"/>
+          <w:numId w:val="2"/>
         </w:numPr>
         <w:rPr>
           <w:sz w:val="21"/>
@@ -1286,14 +1474,14 @@
           <w:sz w:val="21"/>
           <w:szCs w:val="21"/>
         </w:rPr>
-        <w:t>1 - Nicht relevant:</w:t>
-      </w:r>
-      <w:r>
-        <w:rPr>
-          <w:sz w:val="21"/>
-          <w:szCs w:val="21"/>
-        </w:rPr>
-        <w:t xml:space="preserve"> Kein Bezug zu den im Text behandelten Fachkonzepten</w:t>
+        <w:t>1 - Sehr unklar:</w:t>
+      </w:r>
+      <w:r>
+        <w:rPr>
+          <w:sz w:val="21"/>
+          <w:szCs w:val="21"/>
+        </w:rPr>
+        <w:t xml:space="preserve"> Inhaltlich unverständlich, Intention der Frage nicht erkennbar</w:t>
       </w:r>
     </w:p>
     <w:p>
@@ -1301,22 +1489,22 @@
         <w:pStyle w:val="Compact"/>
         <w:numPr>
           <w:ilvl w:val="1"/>
-          <w:numId w:val="4"/>
-        </w:numPr>
-        <w:rPr>
-          <w:sz w:val="21"/>
-          <w:szCs w:val="21"/>
-        </w:rPr>
-      </w:pPr>
-      <w:bookmarkStart w:id="7" w:name="relevanzrelevance"/>
-      <w:r>
-        <w:rPr>
-          <w:sz w:val="21"/>
-          <w:szCs w:val="21"/>
-        </w:rPr>
-        <w:t>Bsp.: “Welche Programmiersprache wird am häufigsten für die Implementierung von Netzwerkprotokollen verwendet?”</w:t>
-      </w:r>
-      <w:bookmarkEnd w:id="7"/>
+          <w:numId w:val="2"/>
+        </w:numPr>
+        <w:rPr>
+          <w:sz w:val="21"/>
+          <w:szCs w:val="21"/>
+        </w:rPr>
+      </w:pPr>
+      <w:bookmarkStart w:id="6" w:name="klarheitclarity"/>
+      <w:r>
+        <w:rPr>
+          <w:sz w:val="21"/>
+          <w:szCs w:val="21"/>
+        </w:rPr>
+        <w:t>Bsp.: “Inwiefern spielt die Schicht eine Rolle bei dem, was passiert, wenn Kommunikation stattfindet?”</w:t>
+      </w:r>
+      <w:bookmarkEnd w:id="6"/>
     </w:p>
     <w:p>
       <w:pPr>
@@ -1325,7 +1513,7 @@
       </w:pPr>
       <w:r>
         <w:rPr/>
-        <w:t>Klarheit/Clarity</w:t>
+        <w:t>Beantwortbarkeit/Answerability</w:t>
       </w:r>
     </w:p>
     <w:p>
@@ -1350,7 +1538,7 @@
           <w:sz w:val="21"/>
           <w:szCs w:val="21"/>
         </w:rPr>
-        <w:t xml:space="preserve"> Wie präzise und inhaltlich eindeutig ist die Frage aus Dozierendenperspektive formuliert? Bewerten Sie auch die inhaltliche Klarheit im Nachhinein für die Beantwortung der Frage.</w:t>
+        <w:t xml:space="preserve"> Hat man aus der Studierendenperspektive ausreichend Informationen im bereitgestellten Text, um die Frage vollständig zu beantworten?</w:t>
       </w:r>
     </w:p>
     <w:p>
@@ -1368,7 +1556,7 @@
           <w:sz w:val="21"/>
           <w:szCs w:val="21"/>
         </w:rPr>
-        <w:t>Hinweis: Hier geht es um inhaltliche Verständlichkeit und Eindeutigkeit, nicht um sprachliche Formulierungen.</w:t>
+        <w:t>Hinweis: Hier geht es nicht um die Schwierigkeit der Frage, sondern nur um die Verfügbarkeit der benötigten Informationen.</w:t>
       </w:r>
     </w:p>
     <w:p>
@@ -1376,7 +1564,7 @@
         <w:pStyle w:val="Compact"/>
         <w:numPr>
           <w:ilvl w:val="0"/>
-          <w:numId w:val="4"/>
+          <w:numId w:val="2"/>
         </w:numPr>
         <w:rPr>
           <w:sz w:val="21"/>
@@ -1390,14 +1578,14 @@
           <w:sz w:val="21"/>
           <w:szCs w:val="21"/>
         </w:rPr>
-        <w:t>5 - Sehr klar:</w:t>
-      </w:r>
-      <w:r>
-        <w:rPr>
-          <w:sz w:val="21"/>
-          <w:szCs w:val="21"/>
-        </w:rPr>
-        <w:t xml:space="preserve"> Inhaltlich präzise und eindeutig formuliert, keine Mehrdeutigkeiten</w:t>
+        <w:t>5 - Vollständig beantwortbar:</w:t>
+      </w:r>
+      <w:r>
+        <w:rPr>
+          <w:sz w:val="21"/>
+          <w:szCs w:val="21"/>
+        </w:rPr>
+        <w:t xml:space="preserve"> Alle Infos explizit im Text verfügbar</w:t>
       </w:r>
     </w:p>
     <w:p>
@@ -1405,19 +1593,19 @@
         <w:pStyle w:val="Compact"/>
         <w:numPr>
           <w:ilvl w:val="1"/>
-          <w:numId w:val="4"/>
-        </w:numPr>
-        <w:rPr>
-          <w:sz w:val="21"/>
-          <w:szCs w:val="21"/>
-        </w:rPr>
-      </w:pPr>
-      <w:r>
-        <w:rPr>
-          <w:sz w:val="21"/>
-          <w:szCs w:val="21"/>
-        </w:rPr>
-        <w:t>Bsp.: “Nennen Sie die Kernaufgaben des Session Layer und erläutern Sie jeweils deren Funktion.”</w:t>
+          <w:numId w:val="2"/>
+        </w:numPr>
+        <w:rPr>
+          <w:sz w:val="21"/>
+          <w:szCs w:val="21"/>
+        </w:rPr>
+      </w:pPr>
+      <w:r>
+        <w:rPr>
+          <w:sz w:val="21"/>
+          <w:szCs w:val="21"/>
+        </w:rPr>
+        <w:t>Bsp: “Welche Kernaufgaben hat der Presentation Layer?”</w:t>
       </w:r>
     </w:p>
     <w:p>
@@ -1425,7 +1613,7 @@
         <w:pStyle w:val="Compact"/>
         <w:numPr>
           <w:ilvl w:val="0"/>
-          <w:numId w:val="4"/>
+          <w:numId w:val="2"/>
         </w:numPr>
         <w:rPr>
           <w:sz w:val="21"/>
@@ -1439,14 +1627,14 @@
           <w:sz w:val="21"/>
           <w:szCs w:val="21"/>
         </w:rPr>
-        <w:t>4 - Klar:</w:t>
-      </w:r>
-      <w:r>
-        <w:rPr>
-          <w:sz w:val="21"/>
-          <w:szCs w:val="21"/>
-        </w:rPr>
-        <w:t xml:space="preserve"> Inhaltlich verständlich mit minimalen Unklarheiten</w:t>
+        <w:t>4 - Gut beantwortbar:</w:t>
+      </w:r>
+      <w:r>
+        <w:rPr>
+          <w:sz w:val="21"/>
+          <w:szCs w:val="21"/>
+        </w:rPr>
+        <w:t xml:space="preserve"> Die meisten Infos im Text</w:t>
       </w:r>
     </w:p>
     <w:p>
@@ -1454,7 +1642,7 @@
         <w:pStyle w:val="Compact"/>
         <w:numPr>
           <w:ilvl w:val="0"/>
-          <w:numId w:val="4"/>
+          <w:numId w:val="2"/>
         </w:numPr>
         <w:rPr>
           <w:sz w:val="21"/>
@@ -1468,14 +1656,14 @@
           <w:sz w:val="21"/>
           <w:szCs w:val="21"/>
         </w:rPr>
-        <w:t>3 - Mäßig klar:</w:t>
-      </w:r>
-      <w:r>
-        <w:rPr>
-          <w:sz w:val="21"/>
-          <w:szCs w:val="21"/>
-        </w:rPr>
-        <w:t xml:space="preserve"> Enthält einige inhaltlich unklare Formulierungen</w:t>
+        <w:t>3 - Teilweise beantwortbar:</w:t>
+      </w:r>
+      <w:r>
+        <w:rPr>
+          <w:sz w:val="21"/>
+          <w:szCs w:val="21"/>
+        </w:rPr>
+        <w:t xml:space="preserve"> Grundinfos vorhanden</w:t>
       </w:r>
     </w:p>
     <w:p>
@@ -1483,7 +1671,7 @@
         <w:pStyle w:val="Compact"/>
         <w:numPr>
           <w:ilvl w:val="0"/>
-          <w:numId w:val="4"/>
+          <w:numId w:val="2"/>
         </w:numPr>
         <w:rPr>
           <w:sz w:val="21"/>
@@ -1497,14 +1685,14 @@
           <w:sz w:val="21"/>
           <w:szCs w:val="21"/>
         </w:rPr>
-        <w:t>2 - Unklar:</w:t>
-      </w:r>
-      <w:r>
-        <w:rPr>
-          <w:sz w:val="21"/>
-          <w:szCs w:val="21"/>
-        </w:rPr>
-        <w:t xml:space="preserve"> Enthält mehrere mehrdeutige oder verwirrende inhaltliche Elemente</w:t>
+        <w:t>2 - Schwer beantwortbar:</w:t>
+      </w:r>
+      <w:r>
+        <w:rPr>
+          <w:sz w:val="21"/>
+          <w:szCs w:val="21"/>
+        </w:rPr>
+        <w:t xml:space="preserve"> Wenige Infos zur Beantwortung vorhanden</w:t>
       </w:r>
     </w:p>
     <w:p>
@@ -1512,7 +1700,7 @@
         <w:pStyle w:val="Compact"/>
         <w:numPr>
           <w:ilvl w:val="0"/>
-          <w:numId w:val="4"/>
+          <w:numId w:val="2"/>
         </w:numPr>
         <w:rPr>
           <w:sz w:val="21"/>
@@ -1526,14 +1714,14 @@
           <w:sz w:val="21"/>
           <w:szCs w:val="21"/>
         </w:rPr>
-        <w:t>1 - Sehr unklar:</w:t>
-      </w:r>
-      <w:r>
-        <w:rPr>
-          <w:sz w:val="21"/>
-          <w:szCs w:val="21"/>
-        </w:rPr>
-        <w:t xml:space="preserve"> Inhaltlich unverständlich, Intention der Frage nicht erkennbar</w:t>
+        <w:t>1 - Nicht beantwortbar:</w:t>
+      </w:r>
+      <w:r>
+        <w:rPr>
+          <w:sz w:val="21"/>
+          <w:szCs w:val="21"/>
+        </w:rPr>
+        <w:t xml:space="preserve"> Benötigte Informationen fehlen</w:t>
       </w:r>
     </w:p>
     <w:p>
@@ -1541,22 +1729,22 @@
         <w:pStyle w:val="Compact"/>
         <w:numPr>
           <w:ilvl w:val="1"/>
-          <w:numId w:val="4"/>
-        </w:numPr>
-        <w:rPr>
-          <w:sz w:val="21"/>
-          <w:szCs w:val="21"/>
-        </w:rPr>
-      </w:pPr>
-      <w:bookmarkStart w:id="8" w:name="klarheitclarity"/>
-      <w:r>
-        <w:rPr>
-          <w:sz w:val="21"/>
-          <w:szCs w:val="21"/>
-        </w:rPr>
-        <w:t>Bsp.: “Inwiefern spielt die Schicht eine Rolle bei dem, was passiert, wenn Kommunikation stattfindet?”</w:t>
-      </w:r>
-      <w:bookmarkEnd w:id="8"/>
+          <w:numId w:val="2"/>
+        </w:numPr>
+        <w:rPr>
+          <w:sz w:val="21"/>
+          <w:szCs w:val="21"/>
+        </w:rPr>
+      </w:pPr>
+      <w:bookmarkStart w:id="7" w:name="beantwortbarkeitanswerability"/>
+      <w:r>
+        <w:rPr>
+          <w:sz w:val="21"/>
+          <w:szCs w:val="21"/>
+        </w:rPr>
+        <w:t>Bsp.: “Vergleichen Sie die Effizienz des ISO-OSI-Modells mit modernen Software-Defined-Networking-Ansätzen.”</w:t>
+      </w:r>
+      <w:bookmarkEnd w:id="7"/>
     </w:p>
     <w:p>
       <w:pPr>
@@ -1565,7 +1753,7 @@
       </w:pPr>
       <w:r>
         <w:rPr/>
-        <w:t>Beantwortbarkeit/Answerability</w:t>
+        <w:t>Herausforderung/Challenging</w:t>
       </w:r>
     </w:p>
     <w:p>
@@ -1590,7 +1778,7 @@
           <w:sz w:val="21"/>
           <w:szCs w:val="21"/>
         </w:rPr>
-        <w:t xml:space="preserve"> Hat man aus der Studierendenperspektive ausreichend Informationen im bereitgestellten Text, um die Frage vollständig zu beantworten?</w:t>
+        <w:t xml:space="preserve"> Wie viel kognitive Anstrengung erfordert die Beantwortung der Frage aus Studierendenperspektive?</w:t>
       </w:r>
     </w:p>
     <w:p>
@@ -1608,7 +1796,7 @@
           <w:sz w:val="21"/>
           <w:szCs w:val="21"/>
         </w:rPr>
-        <w:t>Hinweis: Hier geht es nicht um die Schwierigkeit der Frage, sondern nur um die Verfügbarkeit der benötigten Informationen.</w:t>
+        <w:t>Hinweis: Nicht die Bloom-Taxonomie als Grundlage nehmen, sondern die tatsächlich benötigte kognitive Last einschätzen.</w:t>
       </w:r>
     </w:p>
     <w:p>
@@ -1616,7 +1804,7 @@
         <w:pStyle w:val="Compact"/>
         <w:numPr>
           <w:ilvl w:val="0"/>
-          <w:numId w:val="4"/>
+          <w:numId w:val="2"/>
         </w:numPr>
         <w:rPr>
           <w:sz w:val="21"/>
@@ -1630,14 +1818,14 @@
           <w:sz w:val="21"/>
           <w:szCs w:val="21"/>
         </w:rPr>
-        <w:t>5 - Vollständig beantwortbar:</w:t>
-      </w:r>
-      <w:r>
-        <w:rPr>
-          <w:sz w:val="21"/>
-          <w:szCs w:val="21"/>
-        </w:rPr>
-        <w:t xml:space="preserve"> Alle Infos explizit im Text verfügbar</w:t>
+        <w:t>5 - Sehr herausfordernd:</w:t>
+      </w:r>
+      <w:r>
+        <w:rPr>
+          <w:sz w:val="21"/>
+          <w:szCs w:val="21"/>
+        </w:rPr>
+        <w:t xml:space="preserve"> Erfordert mehrfaches Lesen des gesamten Textes und Verknüpfung vieler Informationen</w:t>
       </w:r>
     </w:p>
     <w:p>
@@ -1645,19 +1833,19 @@
         <w:pStyle w:val="Compact"/>
         <w:numPr>
           <w:ilvl w:val="1"/>
-          <w:numId w:val="4"/>
-        </w:numPr>
-        <w:rPr>
-          <w:sz w:val="21"/>
-          <w:szCs w:val="21"/>
-        </w:rPr>
-      </w:pPr>
-      <w:r>
-        <w:rPr>
-          <w:sz w:val="21"/>
-          <w:szCs w:val="21"/>
-        </w:rPr>
-        <w:t>Bsp: “Welche Kernaufgaben hat der Presentation Layer?”</w:t>
+          <w:numId w:val="2"/>
+        </w:numPr>
+        <w:rPr>
+          <w:sz w:val="21"/>
+          <w:szCs w:val="21"/>
+        </w:rPr>
+      </w:pPr>
+      <w:r>
+        <w:rPr>
+          <w:sz w:val="21"/>
+          <w:szCs w:val="21"/>
+        </w:rPr>
+        <w:t>Bsp.: “Analysieren Sie, warum Flusssteuerung auf mehreren OSI-Schichten implementiert wird, und bewerten Sie die Notwendigkeit dieser Redundanz.”</w:t>
       </w:r>
     </w:p>
     <w:p>
@@ -1665,7 +1853,7 @@
         <w:pStyle w:val="Compact"/>
         <w:numPr>
           <w:ilvl w:val="0"/>
-          <w:numId w:val="4"/>
+          <w:numId w:val="2"/>
         </w:numPr>
         <w:rPr>
           <w:sz w:val="21"/>
@@ -1679,14 +1867,14 @@
           <w:sz w:val="21"/>
           <w:szCs w:val="21"/>
         </w:rPr>
-        <w:t>4 - Gut beantwortbar:</w:t>
-      </w:r>
-      <w:r>
-        <w:rPr>
-          <w:sz w:val="21"/>
-          <w:szCs w:val="21"/>
-        </w:rPr>
-        <w:t xml:space="preserve"> Die meisten Infos im Text</w:t>
+        <w:t>4 - Herausfordernd:</w:t>
+      </w:r>
+      <w:r>
+        <w:rPr>
+          <w:sz w:val="21"/>
+          <w:szCs w:val="21"/>
+        </w:rPr>
+        <w:t xml:space="preserve"> Erfordert Zusammenführen von Informationen aus verschiedenen Textabschnitten</w:t>
       </w:r>
     </w:p>
     <w:p>
@@ -1694,7 +1882,7 @@
         <w:pStyle w:val="Compact"/>
         <w:numPr>
           <w:ilvl w:val="0"/>
-          <w:numId w:val="4"/>
+          <w:numId w:val="2"/>
         </w:numPr>
         <w:rPr>
           <w:sz w:val="21"/>
@@ -1708,14 +1896,14 @@
           <w:sz w:val="21"/>
           <w:szCs w:val="21"/>
         </w:rPr>
-        <w:t>3 - Teilweise beantwortbar:</w:t>
-      </w:r>
-      <w:r>
-        <w:rPr>
-          <w:sz w:val="21"/>
-          <w:szCs w:val="21"/>
-        </w:rPr>
-        <w:t xml:space="preserve"> Grundinfos vorhanden</w:t>
+        <w:t>3 - Mäßig herausfordernd:</w:t>
+      </w:r>
+      <w:r>
+        <w:rPr>
+          <w:sz w:val="21"/>
+          <w:szCs w:val="21"/>
+        </w:rPr>
+        <w:t xml:space="preserve"> Erfordert Nachdenken und eigenes Formulieren, nicht nur Ablesen</w:t>
       </w:r>
     </w:p>
     <w:p>
@@ -1723,7 +1911,7 @@
         <w:pStyle w:val="Compact"/>
         <w:numPr>
           <w:ilvl w:val="0"/>
-          <w:numId w:val="4"/>
+          <w:numId w:val="2"/>
         </w:numPr>
         <w:rPr>
           <w:sz w:val="21"/>
@@ -1737,14 +1925,14 @@
           <w:sz w:val="21"/>
           <w:szCs w:val="21"/>
         </w:rPr>
-        <w:t>2 - Schwer beantwortbar:</w:t>
-      </w:r>
-      <w:r>
-        <w:rPr>
-          <w:sz w:val="21"/>
-          <w:szCs w:val="21"/>
-        </w:rPr>
-        <w:t xml:space="preserve"> Wenige Infos zur Beantwortung vorhanden</w:t>
+        <w:t>2 - Wenig herausfordernd:</w:t>
+      </w:r>
+      <w:r>
+        <w:rPr>
+          <w:sz w:val="21"/>
+          <w:szCs w:val="21"/>
+        </w:rPr>
+        <w:t xml:space="preserve"> Erfordert gezieltes Suchen und Wiedergeben einer Textstelle</w:t>
       </w:r>
     </w:p>
     <w:p>
@@ -1752,7 +1940,7 @@
         <w:pStyle w:val="Compact"/>
         <w:numPr>
           <w:ilvl w:val="0"/>
-          <w:numId w:val="4"/>
+          <w:numId w:val="2"/>
         </w:numPr>
         <w:rPr>
           <w:sz w:val="21"/>
@@ -1766,14 +1954,14 @@
           <w:sz w:val="21"/>
           <w:szCs w:val="21"/>
         </w:rPr>
-        <w:t>1 - Nicht beantwortbar:</w:t>
-      </w:r>
-      <w:r>
-        <w:rPr>
-          <w:sz w:val="21"/>
-          <w:szCs w:val="21"/>
-        </w:rPr>
-        <w:t xml:space="preserve"> Benötigte Informationen fehlen</w:t>
+        <w:t>1 - Nicht herausfordernd:</w:t>
+      </w:r>
+      <w:r>
+        <w:rPr>
+          <w:sz w:val="21"/>
+          <w:szCs w:val="21"/>
+        </w:rPr>
+        <w:t xml:space="preserve"> Antwort kann direkt abgelesen oder mit einem Wort beantwortet werden</w:t>
       </w:r>
     </w:p>
     <w:p>
@@ -1781,22 +1969,52 @@
         <w:pStyle w:val="Compact"/>
         <w:numPr>
           <w:ilvl w:val="1"/>
-          <w:numId w:val="4"/>
-        </w:numPr>
-        <w:rPr>
-          <w:sz w:val="21"/>
-          <w:szCs w:val="21"/>
-        </w:rPr>
-      </w:pPr>
-      <w:bookmarkStart w:id="9" w:name="beantwortbarkeitanswerability"/>
-      <w:r>
-        <w:rPr>
-          <w:sz w:val="21"/>
-          <w:szCs w:val="21"/>
-        </w:rPr>
-        <w:t>Bsp.: “Vergleichen Sie die Effizienz des ISO-OSI-Modells mit modernen Software-Defined-Networking-Ansätzen.”</w:t>
-      </w:r>
-      <w:bookmarkEnd w:id="9"/>
+          <w:numId w:val="2"/>
+        </w:numPr>
+        <w:rPr>
+          <w:sz w:val="21"/>
+          <w:szCs w:val="21"/>
+        </w:rPr>
+      </w:pPr>
+      <w:bookmarkStart w:id="8" w:name="herausforderungchallenging"/>
+      <w:r>
+        <w:rPr>
+          <w:sz w:val="21"/>
+          <w:szCs w:val="21"/>
+        </w:rPr>
+        <w:t>Bsp.: “Wie viele Kernaufgaben hat der Physical Layer?”</w:t>
+      </w:r>
+      <w:bookmarkEnd w:id="8"/>
+    </w:p>
+    <w:p>
+      <w:pPr>
+        <w:pStyle w:val="Compact"/>
+        <w:rPr>
+          <w:sz w:val="22"/>
+          <w:szCs w:val="22"/>
+        </w:rPr>
+      </w:pPr>
+      <w:r>
+        <w:rPr>
+          <w:sz w:val="22"/>
+          <w:szCs w:val="22"/>
+        </w:rPr>
+      </w:r>
+    </w:p>
+    <w:p>
+      <w:pPr>
+        <w:pStyle w:val="Compact"/>
+        <w:rPr>
+          <w:sz w:val="22"/>
+          <w:szCs w:val="22"/>
+        </w:rPr>
+      </w:pPr>
+      <w:r>
+        <w:rPr>
+          <w:sz w:val="22"/>
+          <w:szCs w:val="22"/>
+        </w:rPr>
+      </w:r>
     </w:p>
     <w:p>
       <w:pPr>
@@ -1805,7 +2023,7 @@
       </w:pPr>
       <w:r>
         <w:rPr/>
-        <w:t>Herausforderung/Challenging</w:t>
+        <w:t>Wertigkeit/Value bzgl. Lernzielintegration</w:t>
       </w:r>
     </w:p>
     <w:p>
@@ -1830,7 +2048,7 @@
           <w:sz w:val="21"/>
           <w:szCs w:val="21"/>
         </w:rPr>
-        <w:t xml:space="preserve"> Wie viel kognitive Anstrengung erfordert die Beantwortung der Frage aus Studierendenperspektive?</w:t>
+        <w:t xml:space="preserve"> Wie zentral ist das in der Frage behandelte Fachkonzept für das angestrebte Lernziel des Moduls? Nehmen Sie bei der Bewertung die Perspektive der Dozierenden ein.</w:t>
       </w:r>
     </w:p>
     <w:p>
@@ -1848,7 +2066,7 @@
           <w:sz w:val="21"/>
           <w:szCs w:val="21"/>
         </w:rPr>
-        <w:t>Hinweis: Nicht die Bloom-Taxonomie als Grundlage nehmen, sondern die tatsächlich benötigte kognitive Last einschätzen.</w:t>
+        <w:t>Hinweis: Diese Kategorie bewertet, wie gut die Frage dazu beiträgt, das beschriebene Lernziel des Moduls zu erreichen.</w:t>
       </w:r>
     </w:p>
     <w:p>
@@ -1856,7 +2074,7 @@
         <w:pStyle w:val="Compact"/>
         <w:numPr>
           <w:ilvl w:val="0"/>
-          <w:numId w:val="4"/>
+          <w:numId w:val="2"/>
         </w:numPr>
         <w:rPr>
           <w:sz w:val="21"/>
@@ -1870,14 +2088,14 @@
           <w:sz w:val="21"/>
           <w:szCs w:val="21"/>
         </w:rPr>
-        <w:t>5 - Sehr herausfordernd:</w:t>
-      </w:r>
-      <w:r>
-        <w:rPr>
-          <w:sz w:val="21"/>
-          <w:szCs w:val="21"/>
-        </w:rPr>
-        <w:t xml:space="preserve"> Erfordert mehrfaches Lesen des gesamten Textes und Verknüpfung vieler Informationen</w:t>
+        <w:t>5 - Sehr Hoch:</w:t>
+      </w:r>
+      <w:r>
+        <w:rPr>
+          <w:sz w:val="21"/>
+          <w:szCs w:val="21"/>
+        </w:rPr>
+        <w:t xml:space="preserve"> Behandelt Kernkonzept und zentrales Lernziel (hochrelevant)</w:t>
       </w:r>
     </w:p>
     <w:p>
@@ -1885,19 +2103,19 @@
         <w:pStyle w:val="Compact"/>
         <w:numPr>
           <w:ilvl w:val="1"/>
-          <w:numId w:val="4"/>
-        </w:numPr>
-        <w:rPr>
-          <w:sz w:val="21"/>
-          <w:szCs w:val="21"/>
-        </w:rPr>
-      </w:pPr>
-      <w:r>
-        <w:rPr>
-          <w:sz w:val="21"/>
-          <w:szCs w:val="21"/>
-        </w:rPr>
-        <w:t>Bsp.: “Analysieren Sie, warum Flusssteuerung auf mehreren OSI-Schichten implementiert wird, und bewerten Sie die Notwendigkeit dieser Redundanz.”</w:t>
+          <w:numId w:val="2"/>
+        </w:numPr>
+        <w:rPr>
+          <w:sz w:val="21"/>
+          <w:szCs w:val="21"/>
+        </w:rPr>
+      </w:pPr>
+      <w:r>
+        <w:rPr>
+          <w:sz w:val="21"/>
+          <w:szCs w:val="21"/>
+        </w:rPr>
+        <w:t>Bsp.: “Erklären Sie das Zusammenspiel von Codierung, Transport und Decodierung bei der Übertragung logischer Werte auf physikalischer Ebene.”</w:t>
       </w:r>
     </w:p>
     <w:p>
@@ -1905,7 +2123,7 @@
         <w:pStyle w:val="Compact"/>
         <w:numPr>
           <w:ilvl w:val="0"/>
-          <w:numId w:val="4"/>
+          <w:numId w:val="2"/>
         </w:numPr>
         <w:rPr>
           <w:sz w:val="21"/>
@@ -1919,14 +2137,14 @@
           <w:sz w:val="21"/>
           <w:szCs w:val="21"/>
         </w:rPr>
-        <w:t>4 - Herausfordernd:</w:t>
-      </w:r>
-      <w:r>
-        <w:rPr>
-          <w:sz w:val="21"/>
-          <w:szCs w:val="21"/>
-        </w:rPr>
-        <w:t xml:space="preserve"> Erfordert Zusammenführen von Informationen aus verschiedenen Textabschnitten</w:t>
+        <w:t>4 - Hoch:</w:t>
+      </w:r>
+      <w:r>
+        <w:rPr>
+          <w:sz w:val="21"/>
+          <w:szCs w:val="21"/>
+        </w:rPr>
+        <w:t xml:space="preserve"> Behandelt grundlegendes Konzept zum Lernziel</w:t>
       </w:r>
     </w:p>
     <w:p>
@@ -1934,7 +2152,7 @@
         <w:pStyle w:val="Compact"/>
         <w:numPr>
           <w:ilvl w:val="0"/>
-          <w:numId w:val="4"/>
+          <w:numId w:val="2"/>
         </w:numPr>
         <w:rPr>
           <w:sz w:val="21"/>
@@ -1948,14 +2166,14 @@
           <w:sz w:val="21"/>
           <w:szCs w:val="21"/>
         </w:rPr>
-        <w:t>3 - Mäßig herausfordernd:</w:t>
-      </w:r>
-      <w:r>
-        <w:rPr>
-          <w:sz w:val="21"/>
-          <w:szCs w:val="21"/>
-        </w:rPr>
-        <w:t xml:space="preserve"> Erfordert Nachdenken und eigenes Formulieren, nicht nur Ablesen</w:t>
+        <w:t>3 - Mäßig:</w:t>
+      </w:r>
+      <w:r>
+        <w:rPr>
+          <w:sz w:val="21"/>
+          <w:szCs w:val="21"/>
+        </w:rPr>
+        <w:t xml:space="preserve"> Behandelt Grundlagen, die aber nicht direkt zum Lernziel passen (oder gehen darüber hinaus)</w:t>
       </w:r>
     </w:p>
     <w:p>
@@ -1963,7 +2181,7 @@
         <w:pStyle w:val="Compact"/>
         <w:numPr>
           <w:ilvl w:val="0"/>
-          <w:numId w:val="4"/>
+          <w:numId w:val="2"/>
         </w:numPr>
         <w:rPr>
           <w:sz w:val="21"/>
@@ -1977,14 +2195,14 @@
           <w:sz w:val="21"/>
           <w:szCs w:val="21"/>
         </w:rPr>
-        <w:t>2 - Wenig herausfordernd:</w:t>
-      </w:r>
-      <w:r>
-        <w:rPr>
-          <w:sz w:val="21"/>
-          <w:szCs w:val="21"/>
-        </w:rPr>
-        <w:t xml:space="preserve"> Erfordert gezieltes Suchen und Wiedergeben einer Textstelle</w:t>
+        <w:t>2 - Gering:</w:t>
+      </w:r>
+      <w:r>
+        <w:rPr>
+          <w:sz w:val="21"/>
+          <w:szCs w:val="21"/>
+        </w:rPr>
+        <w:t xml:space="preserve"> Fokussiert auf nebensächliches Detail oder ist ineffizient für das Lernziel</w:t>
       </w:r>
     </w:p>
     <w:p>
@@ -1992,7 +2210,7 @@
         <w:pStyle w:val="Compact"/>
         <w:numPr>
           <w:ilvl w:val="0"/>
-          <w:numId w:val="4"/>
+          <w:numId w:val="2"/>
         </w:numPr>
         <w:rPr>
           <w:sz w:val="21"/>
@@ -2006,14 +2224,14 @@
           <w:sz w:val="21"/>
           <w:szCs w:val="21"/>
         </w:rPr>
-        <w:t>1 - Nicht herausfordernd:</w:t>
-      </w:r>
-      <w:r>
-        <w:rPr>
-          <w:sz w:val="21"/>
-          <w:szCs w:val="21"/>
-        </w:rPr>
-        <w:t xml:space="preserve"> Antwort kann direkt abgelesen oder mit einem Wort beantwortet werden</w:t>
+        <w:t>1 - Nicht vorhanden:</w:t>
+      </w:r>
+      <w:r>
+        <w:rPr>
+          <w:sz w:val="21"/>
+          <w:szCs w:val="21"/>
+        </w:rPr>
+        <w:t xml:space="preserve"> Passt gar nicht zum Lernziel</w:t>
       </w:r>
     </w:p>
     <w:p>
@@ -2021,52 +2239,22 @@
         <w:pStyle w:val="Compact"/>
         <w:numPr>
           <w:ilvl w:val="1"/>
-          <w:numId w:val="4"/>
-        </w:numPr>
-        <w:rPr>
-          <w:sz w:val="21"/>
-          <w:szCs w:val="21"/>
-        </w:rPr>
-      </w:pPr>
-      <w:bookmarkStart w:id="10" w:name="herausforderungchallenging"/>
-      <w:r>
-        <w:rPr>
-          <w:sz w:val="21"/>
-          <w:szCs w:val="21"/>
-        </w:rPr>
-        <w:t>Bsp.: “Wie viele Kernaufgaben hat der Physical Layer?”</w:t>
-      </w:r>
-      <w:bookmarkEnd w:id="10"/>
-    </w:p>
-    <w:p>
-      <w:pPr>
-        <w:pStyle w:val="Compact"/>
-        <w:rPr>
-          <w:sz w:val="22"/>
-          <w:szCs w:val="22"/>
-        </w:rPr>
-      </w:pPr>
-      <w:r>
-        <w:rPr>
-          <w:sz w:val="22"/>
-          <w:szCs w:val="22"/>
-        </w:rPr>
-      </w:r>
-    </w:p>
-    <w:p>
-      <w:pPr>
-        <w:pStyle w:val="Compact"/>
-        <w:rPr>
-          <w:sz w:val="22"/>
-          <w:szCs w:val="22"/>
-        </w:rPr>
-      </w:pPr>
-      <w:r>
-        <w:rPr>
-          <w:sz w:val="22"/>
-          <w:szCs w:val="22"/>
-        </w:rPr>
-      </w:r>
+          <w:numId w:val="2"/>
+        </w:numPr>
+        <w:rPr>
+          <w:sz w:val="21"/>
+          <w:szCs w:val="21"/>
+        </w:rPr>
+      </w:pPr>
+      <w:bookmarkStart w:id="9" w:name="Xc726736414fc4f5118f498bc21832f0e03ad1b3"/>
+      <w:r>
+        <w:rPr>
+          <w:sz w:val="21"/>
+          <w:szCs w:val="21"/>
+        </w:rPr>
+        <w:t>Bsp.: “Nennen Sie ein Beispiel für ein Kabel, das zur Datenübertragung verwendet werden kann.”</w:t>
+      </w:r>
+      <w:bookmarkEnd w:id="9"/>
     </w:p>
     <w:p>
       <w:pPr>
@@ -2075,7 +2263,7 @@
       </w:pPr>
       <w:r>
         <w:rPr/>
-        <w:t>Wertigkeit/Value bzgl. Lernzielintegration</w:t>
+        <w:t>Sprachqualität/Language</w:t>
       </w:r>
     </w:p>
     <w:p>
@@ -2100,7 +2288,7 @@
           <w:sz w:val="21"/>
           <w:szCs w:val="21"/>
         </w:rPr>
-        <w:t xml:space="preserve"> Wie zentral ist das in der Frage behandelte Fachkonzept für das angestrebte Lernziel des Moduls? Nehmen Sie bei der Bewertung die Perspektive der Dozierenden ein.</w:t>
+        <w:t xml:space="preserve"> Wie angemessen ist aus Dozierendenperspektive die sprachliche Formulierung hinsichtlich Grammatik und Verständlichkeit? Bewerten Sie auch die sprachliche Präzision im Nachhinein für die Beantwortung der Frage.</w:t>
       </w:r>
     </w:p>
     <w:p>
@@ -2118,7 +2306,7 @@
           <w:sz w:val="21"/>
           <w:szCs w:val="21"/>
         </w:rPr>
-        <w:t>Hinweis: Diese Kategorie bewertet, wie gut die Frage dazu beiträgt, das beschriebene Lernziel des Moduls zu erreichen.</w:t>
+        <w:t>Hinweis: Hier geht es ausschließlich um die sprachliche Form und Präzision, nicht um den Inhalt.</w:t>
       </w:r>
     </w:p>
     <w:p>
@@ -2126,7 +2314,7 @@
         <w:pStyle w:val="Compact"/>
         <w:numPr>
           <w:ilvl w:val="0"/>
-          <w:numId w:val="4"/>
+          <w:numId w:val="2"/>
         </w:numPr>
         <w:rPr>
           <w:sz w:val="21"/>
@@ -2140,14 +2328,14 @@
           <w:sz w:val="21"/>
           <w:szCs w:val="21"/>
         </w:rPr>
-        <w:t>5 - Sehr Hoch:</w:t>
-      </w:r>
-      <w:r>
-        <w:rPr>
-          <w:sz w:val="21"/>
-          <w:szCs w:val="21"/>
-        </w:rPr>
-        <w:t xml:space="preserve"> Behandelt Kernkonzept und zentrales Lernziel (hochrelevant)</w:t>
+        <w:t>5 - Ausgezeichnet:</w:t>
+      </w:r>
+      <w:r>
+        <w:rPr>
+          <w:sz w:val="21"/>
+          <w:szCs w:val="21"/>
+        </w:rPr>
+        <w:t xml:space="preserve"> Präzise, angemessen, gut verständlich</w:t>
       </w:r>
     </w:p>
     <w:p>
@@ -2155,19 +2343,19 @@
         <w:pStyle w:val="Compact"/>
         <w:numPr>
           <w:ilvl w:val="1"/>
-          <w:numId w:val="4"/>
-        </w:numPr>
-        <w:rPr>
-          <w:sz w:val="21"/>
-          <w:szCs w:val="21"/>
-        </w:rPr>
-      </w:pPr>
-      <w:r>
-        <w:rPr>
-          <w:sz w:val="21"/>
-          <w:szCs w:val="21"/>
-        </w:rPr>
-        <w:t>Bsp.: “Erklären Sie das Zusammenspiel von Codierung, Transport und Decodierung bei der Übertragung logischer Werte auf physikalischer Ebene.”</w:t>
+          <w:numId w:val="2"/>
+        </w:numPr>
+        <w:rPr>
+          <w:sz w:val="21"/>
+          <w:szCs w:val="21"/>
+        </w:rPr>
+      </w:pPr>
+      <w:r>
+        <w:rPr>
+          <w:sz w:val="21"/>
+          <w:szCs w:val="21"/>
+        </w:rPr>
+        <w:t>Bsp.: “Ermitteln Sie, welche OSI-Schicht für das Setzen von Synchronisationspunkten verantwortlich ist, und erläutern Sie deren Zweck.”</w:t>
       </w:r>
     </w:p>
     <w:p>
@@ -2175,7 +2363,7 @@
         <w:pStyle w:val="Compact"/>
         <w:numPr>
           <w:ilvl w:val="0"/>
-          <w:numId w:val="4"/>
+          <w:numId w:val="2"/>
         </w:numPr>
         <w:rPr>
           <w:sz w:val="21"/>
@@ -2189,14 +2377,14 @@
           <w:sz w:val="21"/>
           <w:szCs w:val="21"/>
         </w:rPr>
-        <w:t>4 - Hoch:</w:t>
-      </w:r>
-      <w:r>
-        <w:rPr>
-          <w:sz w:val="21"/>
-          <w:szCs w:val="21"/>
-        </w:rPr>
-        <w:t xml:space="preserve"> Behandelt grundlegendes Konzept zum Lernziel</w:t>
+        <w:t>4 - Gut:</w:t>
+      </w:r>
+      <w:r>
+        <w:rPr>
+          <w:sz w:val="21"/>
+          <w:szCs w:val="21"/>
+        </w:rPr>
+        <w:t xml:space="preserve"> Verständlich mit kleinen Schwächen</w:t>
       </w:r>
     </w:p>
     <w:p>
@@ -2204,7 +2392,7 @@
         <w:pStyle w:val="Compact"/>
         <w:numPr>
           <w:ilvl w:val="0"/>
-          <w:numId w:val="4"/>
+          <w:numId w:val="2"/>
         </w:numPr>
         <w:rPr>
           <w:sz w:val="21"/>
@@ -2218,14 +2406,14 @@
           <w:sz w:val="21"/>
           <w:szCs w:val="21"/>
         </w:rPr>
-        <w:t>3 - Mäßig:</w:t>
-      </w:r>
-      <w:r>
-        <w:rPr>
-          <w:sz w:val="21"/>
-          <w:szCs w:val="21"/>
-        </w:rPr>
-        <w:t xml:space="preserve"> Behandelt Grundlagen, die aber nicht direkt zum Lernziel passen (oder gehen darüber hinaus)</w:t>
+        <w:t>3 - Befriedigend:</w:t>
+      </w:r>
+      <w:r>
+        <w:rPr>
+          <w:sz w:val="21"/>
+          <w:szCs w:val="21"/>
+        </w:rPr>
+        <w:t xml:space="preserve"> Umständlich oder unpräzise</w:t>
       </w:r>
     </w:p>
     <w:p>
@@ -2233,7 +2421,7 @@
         <w:pStyle w:val="Compact"/>
         <w:numPr>
           <w:ilvl w:val="0"/>
-          <w:numId w:val="4"/>
+          <w:numId w:val="2"/>
         </w:numPr>
         <w:rPr>
           <w:sz w:val="21"/>
@@ -2247,14 +2435,14 @@
           <w:sz w:val="21"/>
           <w:szCs w:val="21"/>
         </w:rPr>
-        <w:t>2 - Gering:</w:t>
-      </w:r>
-      <w:r>
-        <w:rPr>
-          <w:sz w:val="21"/>
-          <w:szCs w:val="21"/>
-        </w:rPr>
-        <w:t xml:space="preserve"> Fokussiert auf nebensächliches Detail oder ist ineffizient für das Lernziel</w:t>
+        <w:t>2 - Mangelhaft:</w:t>
+      </w:r>
+      <w:r>
+        <w:rPr>
+          <w:sz w:val="21"/>
+          <w:szCs w:val="21"/>
+        </w:rPr>
+        <w:t xml:space="preserve"> Schwerfällig, weitschweifig oder unnötig komplex</w:t>
       </w:r>
     </w:p>
     <w:p>
@@ -2262,7 +2450,7 @@
         <w:pStyle w:val="Compact"/>
         <w:numPr>
           <w:ilvl w:val="0"/>
-          <w:numId w:val="4"/>
+          <w:numId w:val="2"/>
         </w:numPr>
         <w:rPr>
           <w:sz w:val="21"/>
@@ -2276,14 +2464,14 @@
           <w:sz w:val="21"/>
           <w:szCs w:val="21"/>
         </w:rPr>
-        <w:t>1 - Nicht vorhanden:</w:t>
-      </w:r>
-      <w:r>
-        <w:rPr>
-          <w:sz w:val="21"/>
-          <w:szCs w:val="21"/>
-        </w:rPr>
-        <w:t xml:space="preserve"> Passt gar nicht zum Lernziel</w:t>
+        <w:t>1 - Ungenügend:</w:t>
+      </w:r>
+      <w:r>
+        <w:rPr>
+          <w:sz w:val="21"/>
+          <w:szCs w:val="21"/>
+        </w:rPr>
+        <w:t xml:space="preserve"> Gar nicht verständlich</w:t>
       </w:r>
     </w:p>
     <w:p>
@@ -2291,22 +2479,22 @@
         <w:pStyle w:val="Compact"/>
         <w:numPr>
           <w:ilvl w:val="1"/>
-          <w:numId w:val="4"/>
-        </w:numPr>
-        <w:rPr>
-          <w:sz w:val="21"/>
-          <w:szCs w:val="21"/>
-        </w:rPr>
-      </w:pPr>
-      <w:bookmarkStart w:id="11" w:name="Xc726736414fc4f5118f498bc21832f0e03ad1b3"/>
-      <w:r>
-        <w:rPr>
-          <w:sz w:val="21"/>
-          <w:szCs w:val="21"/>
-        </w:rPr>
-        <w:t>Bsp.: “Nennen Sie ein Beispiel für ein Kabel, das zur Datenübertragung verwendet werden kann.”</w:t>
-      </w:r>
-      <w:bookmarkEnd w:id="11"/>
+          <w:numId w:val="2"/>
+        </w:numPr>
+        <w:rPr>
+          <w:sz w:val="21"/>
+          <w:szCs w:val="21"/>
+        </w:rPr>
+      </w:pPr>
+      <w:bookmarkStart w:id="10" w:name="sprachqualitätlanguage"/>
+      <w:r>
+        <w:rPr>
+          <w:sz w:val="21"/>
+          <w:szCs w:val="21"/>
+        </w:rPr>
+        <w:t>Bsp.: “Im Kontext der vielschichtigen und diversen Betrachtungsweise der Aufgabenbereiche, die dem Physical Layer im Rahmen des OSI-Referenzmodells zugeschrieben werden können, erläutern Sie diese unter Berücksichtigung relevanter Aspekte.”</w:t>
+      </w:r>
+      <w:bookmarkEnd w:id="10"/>
     </w:p>
     <w:p>
       <w:pPr>
@@ -2315,7 +2503,7 @@
       </w:pPr>
       <w:r>
         <w:rPr/>
-        <w:t>Sprachqualität/Language</w:t>
+        <w:t>Korrektheit/Correctness</w:t>
       </w:r>
     </w:p>
     <w:p>
@@ -2340,7 +2528,7 @@
           <w:sz w:val="21"/>
           <w:szCs w:val="21"/>
         </w:rPr>
-        <w:t xml:space="preserve"> Wie angemessen ist aus Dozierendenperspektive die sprachliche Formulierung hinsichtlich Grammatik und Verständlichkeit? Bewerten Sie auch die sprachliche Präzision im Nachhinein für die Beantwortung der Frage.</w:t>
+        <w:t xml:space="preserve"> Wie korrekt ist die generierte Antwort auf Basis des Textinhalts? Nehmen Sie bei der Bewertung die Perspektive der Dozierenden ein.</w:t>
       </w:r>
     </w:p>
     <w:p>
@@ -2358,7 +2546,7 @@
           <w:sz w:val="21"/>
           <w:szCs w:val="21"/>
         </w:rPr>
-        <w:t>Hinweis: Hier geht es ausschließlich um die sprachliche Form und Präzision, nicht um den Inhalt.</w:t>
+        <w:t>Hinweis: Diese Kategorie bewertet die Passung der Antwort zu Textinhalt und Frage.</w:t>
       </w:r>
     </w:p>
     <w:p>
@@ -2366,7 +2554,7 @@
         <w:pStyle w:val="Compact"/>
         <w:numPr>
           <w:ilvl w:val="0"/>
-          <w:numId w:val="4"/>
+          <w:numId w:val="2"/>
         </w:numPr>
         <w:rPr>
           <w:sz w:val="21"/>
@@ -2380,14 +2568,14 @@
           <w:sz w:val="21"/>
           <w:szCs w:val="21"/>
         </w:rPr>
-        <w:t>5 - Ausgezeichnet:</w:t>
-      </w:r>
-      <w:r>
-        <w:rPr>
-          <w:sz w:val="21"/>
-          <w:szCs w:val="21"/>
-        </w:rPr>
-        <w:t xml:space="preserve"> Präzise, angemessen, gut verständlich</w:t>
+        <w:t>5 - Vollständig korrekt:</w:t>
+      </w:r>
+      <w:r>
+        <w:rPr>
+          <w:sz w:val="21"/>
+          <w:szCs w:val="21"/>
+        </w:rPr>
+        <w:t xml:space="preserve"> Antwort entspricht vollständig dem Textinhalt</w:t>
       </w:r>
     </w:p>
     <w:p>
@@ -2395,19 +2583,19 @@
         <w:pStyle w:val="Compact"/>
         <w:numPr>
           <w:ilvl w:val="1"/>
-          <w:numId w:val="4"/>
-        </w:numPr>
-        <w:rPr>
-          <w:sz w:val="21"/>
-          <w:szCs w:val="21"/>
-        </w:rPr>
-      </w:pPr>
-      <w:r>
-        <w:rPr>
-          <w:sz w:val="21"/>
-          <w:szCs w:val="21"/>
-        </w:rPr>
-        <w:t>Bsp.: “Ermitteln Sie, welche OSI-Schicht für das Setzen von Synchronisationspunkten verantwortlich ist, und erläutern Sie deren Zweck.”</w:t>
+          <w:numId w:val="2"/>
+        </w:numPr>
+        <w:rPr>
+          <w:sz w:val="21"/>
+          <w:szCs w:val="21"/>
+        </w:rPr>
+      </w:pPr>
+      <w:r>
+        <w:rPr>
+          <w:sz w:val="21"/>
+          <w:szCs w:val="21"/>
+        </w:rPr>
+        <w:t>Bsp.: “Beschreiben Sie, wie der Network Layer die Kommunikation zwischen Geräten in unterschiedlichen Netzen ermöglicht.”</w:t>
       </w:r>
     </w:p>
     <w:p>
@@ -2415,7 +2603,7 @@
         <w:pStyle w:val="Compact"/>
         <w:numPr>
           <w:ilvl w:val="0"/>
-          <w:numId w:val="4"/>
+          <w:numId w:val="2"/>
         </w:numPr>
         <w:rPr>
           <w:sz w:val="21"/>
@@ -2429,14 +2617,14 @@
           <w:sz w:val="21"/>
           <w:szCs w:val="21"/>
         </w:rPr>
-        <w:t>4 - Gut:</w:t>
-      </w:r>
-      <w:r>
-        <w:rPr>
-          <w:sz w:val="21"/>
-          <w:szCs w:val="21"/>
-        </w:rPr>
-        <w:t xml:space="preserve"> Verständlich mit kleinen Schwächen</w:t>
+        <w:t>4 - Überwiegend korrekt:</w:t>
+      </w:r>
+      <w:r>
+        <w:rPr>
+          <w:sz w:val="21"/>
+          <w:szCs w:val="21"/>
+        </w:rPr>
+        <w:t xml:space="preserve"> Antwort überwiegend korrekt, minimale Ungenauigkeiten</w:t>
       </w:r>
     </w:p>
     <w:p>
@@ -2444,7 +2632,7 @@
         <w:pStyle w:val="Compact"/>
         <w:numPr>
           <w:ilvl w:val="0"/>
-          <w:numId w:val="4"/>
+          <w:numId w:val="2"/>
         </w:numPr>
         <w:rPr>
           <w:sz w:val="21"/>
@@ -2458,14 +2646,14 @@
           <w:sz w:val="21"/>
           <w:szCs w:val="21"/>
         </w:rPr>
-        <w:t>3 - Befriedigend:</w:t>
-      </w:r>
-      <w:r>
-        <w:rPr>
-          <w:sz w:val="21"/>
-          <w:szCs w:val="21"/>
-        </w:rPr>
-        <w:t xml:space="preserve"> Umständlich oder unpräzise</w:t>
+        <w:t>3 - Teilweise korrekt:</w:t>
+      </w:r>
+      <w:r>
+        <w:rPr>
+          <w:sz w:val="21"/>
+          <w:szCs w:val="21"/>
+        </w:rPr>
+        <w:t xml:space="preserve"> Erkennbare Ungenauigkeiten oder unvollständige Wiedergabe von Fakten</w:t>
       </w:r>
     </w:p>
     <w:p>
@@ -2473,7 +2661,7 @@
         <w:pStyle w:val="Compact"/>
         <w:numPr>
           <w:ilvl w:val="0"/>
-          <w:numId w:val="4"/>
+          <w:numId w:val="2"/>
         </w:numPr>
         <w:rPr>
           <w:sz w:val="21"/>
@@ -2487,14 +2675,14 @@
           <w:sz w:val="21"/>
           <w:szCs w:val="21"/>
         </w:rPr>
-        <w:t>2 - Mangelhaft:</w:t>
-      </w:r>
-      <w:r>
-        <w:rPr>
-          <w:sz w:val="21"/>
-          <w:szCs w:val="21"/>
-        </w:rPr>
-        <w:t xml:space="preserve"> Schwerfällig, weitschweifig oder unnötig komplex</w:t>
+        <w:t>2 - Größtenteils inkorrekt:</w:t>
+      </w:r>
+      <w:r>
+        <w:rPr>
+          <w:sz w:val="21"/>
+          <w:szCs w:val="21"/>
+        </w:rPr>
+        <w:t xml:space="preserve"> Mehrere Fehler oder Missverständnisse des Textinhalts</w:t>
       </w:r>
     </w:p>
     <w:p>
@@ -2502,7 +2690,7 @@
         <w:pStyle w:val="Compact"/>
         <w:numPr>
           <w:ilvl w:val="0"/>
-          <w:numId w:val="4"/>
+          <w:numId w:val="2"/>
         </w:numPr>
         <w:rPr>
           <w:sz w:val="21"/>
@@ -2516,14 +2704,14 @@
           <w:sz w:val="21"/>
           <w:szCs w:val="21"/>
         </w:rPr>
-        <w:t>1 - Ungenügend:</w:t>
-      </w:r>
-      <w:r>
-        <w:rPr>
-          <w:sz w:val="21"/>
-          <w:szCs w:val="21"/>
-        </w:rPr>
-        <w:t xml:space="preserve"> Gar nicht verständlich</w:t>
+        <w:t>1 - Völlig inkorrekt:</w:t>
+      </w:r>
+      <w:r>
+        <w:rPr>
+          <w:sz w:val="21"/>
+          <w:szCs w:val="21"/>
+        </w:rPr>
+        <w:t xml:space="preserve"> Antwort enthält grundlegend falsche Inhalte</w:t>
       </w:r>
     </w:p>
     <w:p>
@@ -2531,264 +2719,24 @@
         <w:pStyle w:val="Compact"/>
         <w:numPr>
           <w:ilvl w:val="1"/>
-          <w:numId w:val="4"/>
-        </w:numPr>
-        <w:rPr>
-          <w:sz w:val="21"/>
-          <w:szCs w:val="21"/>
-        </w:rPr>
-      </w:pPr>
-      <w:bookmarkStart w:id="12" w:name="sprachqualitätlanguage"/>
-      <w:r>
-        <w:rPr>
-          <w:sz w:val="21"/>
-          <w:szCs w:val="21"/>
-        </w:rPr>
-        <w:t>Bsp.: “Im Kontext der vielschichtigen und diversen Betrachtungsweise der Aufgabenbereiche, die dem Physical Layer im Rahmen des OSI-Referenzmodells zugeschrieben werden können, erläutern Sie diese unter Berücksichtigung relevanter Aspekte.”</w:t>
-      </w:r>
+          <w:numId w:val="2"/>
+        </w:numPr>
+        <w:rPr>
+          <w:sz w:val="21"/>
+          <w:szCs w:val="21"/>
+        </w:rPr>
+      </w:pPr>
+      <w:bookmarkStart w:id="11" w:name="X5adecf790d361ef61a0e462edd7ab013df4437a"/>
+      <w:bookmarkStart w:id="12" w:name="korrektheitcorrectness"/>
+      <w:r>
+        <w:rPr>
+          <w:sz w:val="21"/>
+          <w:szCs w:val="21"/>
+        </w:rPr>
+        <w:t>Bsp.: “Warum ist der Physical Layer für die Verschlüsselung von Daten zuständig?”</w:t>
+      </w:r>
+      <w:bookmarkEnd w:id="11"/>
       <w:bookmarkEnd w:id="12"/>
-    </w:p>
-    <w:p>
-      <w:pPr>
-        <w:pStyle w:val="Heading2"/>
-        <w:rPr/>
-      </w:pPr>
-      <w:r>
-        <w:rPr/>
-        <w:t>Korrektheit/Correctness</w:t>
-      </w:r>
-    </w:p>
-    <w:p>
-      <w:pPr>
-        <w:pStyle w:val="FirstParagraph"/>
-        <w:rPr>
-          <w:sz w:val="21"/>
-          <w:szCs w:val="21"/>
-        </w:rPr>
-      </w:pPr>
-      <w:r>
-        <w:rPr>
-          <w:b/>
-          <w:bCs/>
-          <w:sz w:val="21"/>
-          <w:szCs w:val="21"/>
-        </w:rPr>
-        <w:t>Fragestellung:</w:t>
-      </w:r>
-      <w:r>
-        <w:rPr>
-          <w:sz w:val="21"/>
-          <w:szCs w:val="21"/>
-        </w:rPr>
-        <w:t xml:space="preserve"> Wie korrekt ist die generierte Antwort auf Basis des Textinhalts? Nehmen Sie bei der Bewertung die Perspektive der Dozierenden ein.</w:t>
-      </w:r>
-    </w:p>
-    <w:p>
-      <w:pPr>
-        <w:pStyle w:val="BodyText"/>
-        <w:rPr>
-          <w:sz w:val="21"/>
-          <w:szCs w:val="21"/>
-        </w:rPr>
-      </w:pPr>
-      <w:r>
-        <w:rPr>
-          <w:i/>
-          <w:iCs/>
-          <w:sz w:val="21"/>
-          <w:szCs w:val="21"/>
-        </w:rPr>
-        <w:t>Hinweis: Diese Kategorie bewertet die Passung der Antwort zu Textinhalt und Frage.</w:t>
-      </w:r>
-    </w:p>
-    <w:p>
-      <w:pPr>
-        <w:pStyle w:val="Compact"/>
-        <w:numPr>
-          <w:ilvl w:val="0"/>
-          <w:numId w:val="4"/>
-        </w:numPr>
-        <w:rPr>
-          <w:sz w:val="21"/>
-          <w:szCs w:val="21"/>
-        </w:rPr>
-      </w:pPr>
-      <w:r>
-        <w:rPr>
-          <w:b/>
-          <w:bCs/>
-          <w:sz w:val="21"/>
-          <w:szCs w:val="21"/>
-        </w:rPr>
-        <w:t>5 - Vollständig korrekt:</w:t>
-      </w:r>
-      <w:r>
-        <w:rPr>
-          <w:sz w:val="21"/>
-          <w:szCs w:val="21"/>
-        </w:rPr>
-        <w:t xml:space="preserve"> Antwort entspricht vollständig dem Textinhalt</w:t>
-      </w:r>
-    </w:p>
-    <w:p>
-      <w:pPr>
-        <w:pStyle w:val="Compact"/>
-        <w:numPr>
-          <w:ilvl w:val="1"/>
-          <w:numId w:val="4"/>
-        </w:numPr>
-        <w:rPr>
-          <w:sz w:val="21"/>
-          <w:szCs w:val="21"/>
-        </w:rPr>
-      </w:pPr>
-      <w:r>
-        <w:rPr>
-          <w:sz w:val="21"/>
-          <w:szCs w:val="21"/>
-        </w:rPr>
-        <w:t>Bsp.: “Beschreiben Sie, wie der Network Layer die Kommunikation zwischen Geräten in unterschiedlichen Netzen ermöglicht.”</w:t>
-      </w:r>
-    </w:p>
-    <w:p>
-      <w:pPr>
-        <w:pStyle w:val="Compact"/>
-        <w:numPr>
-          <w:ilvl w:val="0"/>
-          <w:numId w:val="4"/>
-        </w:numPr>
-        <w:rPr>
-          <w:sz w:val="21"/>
-          <w:szCs w:val="21"/>
-        </w:rPr>
-      </w:pPr>
-      <w:r>
-        <w:rPr>
-          <w:b/>
-          <w:bCs/>
-          <w:sz w:val="21"/>
-          <w:szCs w:val="21"/>
-        </w:rPr>
-        <w:t>4 - Überwiegend korrekt:</w:t>
-      </w:r>
-      <w:r>
-        <w:rPr>
-          <w:sz w:val="21"/>
-          <w:szCs w:val="21"/>
-        </w:rPr>
-        <w:t xml:space="preserve"> Antwort überwiegend korrekt, minimale Ungenauigkeiten</w:t>
-      </w:r>
-    </w:p>
-    <w:p>
-      <w:pPr>
-        <w:pStyle w:val="Compact"/>
-        <w:numPr>
-          <w:ilvl w:val="0"/>
-          <w:numId w:val="4"/>
-        </w:numPr>
-        <w:rPr>
-          <w:sz w:val="21"/>
-          <w:szCs w:val="21"/>
-        </w:rPr>
-      </w:pPr>
-      <w:r>
-        <w:rPr>
-          <w:b/>
-          <w:bCs/>
-          <w:sz w:val="21"/>
-          <w:szCs w:val="21"/>
-        </w:rPr>
-        <w:t>3 - Teilweise korrekt:</w:t>
-      </w:r>
-      <w:r>
-        <w:rPr>
-          <w:sz w:val="21"/>
-          <w:szCs w:val="21"/>
-        </w:rPr>
-        <w:t xml:space="preserve"> Erkennbare Ungenauigkeiten oder unvollständige Wiedergabe von Fakten</w:t>
-      </w:r>
-    </w:p>
-    <w:p>
-      <w:pPr>
-        <w:pStyle w:val="Compact"/>
-        <w:numPr>
-          <w:ilvl w:val="0"/>
-          <w:numId w:val="4"/>
-        </w:numPr>
-        <w:rPr>
-          <w:sz w:val="21"/>
-          <w:szCs w:val="21"/>
-        </w:rPr>
-      </w:pPr>
-      <w:r>
-        <w:rPr>
-          <w:b/>
-          <w:bCs/>
-          <w:sz w:val="21"/>
-          <w:szCs w:val="21"/>
-        </w:rPr>
-        <w:t>2 - Größtenteils inkorrekt:</w:t>
-      </w:r>
-      <w:r>
-        <w:rPr>
-          <w:sz w:val="21"/>
-          <w:szCs w:val="21"/>
-        </w:rPr>
-        <w:t xml:space="preserve"> Mehrere Fehler oder Missverständnisse des Textinhalts</w:t>
-      </w:r>
-    </w:p>
-    <w:p>
-      <w:pPr>
-        <w:pStyle w:val="Compact"/>
-        <w:numPr>
-          <w:ilvl w:val="0"/>
-          <w:numId w:val="4"/>
-        </w:numPr>
-        <w:rPr>
-          <w:sz w:val="21"/>
-          <w:szCs w:val="21"/>
-        </w:rPr>
-      </w:pPr>
-      <w:r>
-        <w:rPr>
-          <w:b/>
-          <w:bCs/>
-          <w:sz w:val="21"/>
-          <w:szCs w:val="21"/>
-        </w:rPr>
-        <w:t>1 - Völlig inkorrekt:</w:t>
-      </w:r>
-      <w:r>
-        <w:rPr>
-          <w:sz w:val="21"/>
-          <w:szCs w:val="21"/>
-        </w:rPr>
-        <w:t xml:space="preserve"> Antwort enthält grundlegend falsche Inhalte</w:t>
-      </w:r>
-    </w:p>
-    <w:p>
-      <w:pPr>
-        <w:pStyle w:val="Compact"/>
-        <w:numPr>
-          <w:ilvl w:val="1"/>
-          <w:numId w:val="4"/>
-        </w:numPr>
-        <w:rPr>
-          <w:sz w:val="21"/>
-          <w:szCs w:val="21"/>
-        </w:rPr>
-      </w:pPr>
-      <w:bookmarkStart w:id="13" w:name="korrektheitcorrectness"/>
-      <w:bookmarkStart w:id="14" w:name="X5adecf790d361ef61a0e462edd7ab013df4437a"/>
-      <w:r>
-        <w:rPr>
-          <w:sz w:val="21"/>
-          <w:szCs w:val="21"/>
-        </w:rPr>
-        <w:t>Bsp.: “Warum ist der Physical Layer für die Verschlüsselung von Daten zuständig?”</w:t>
-      </w:r>
-      <w:bookmarkEnd w:id="13"/>
-      <w:bookmarkEnd w:id="14"/>
     </w:p>
     <w:p>
       <w:pPr>
@@ -3085,7 +3033,7 @@
           <w:szCs w:val="22"/>
         </w:rPr>
       </w:pPr>
-      <w:bookmarkStart w:id="15" w:name="lernziel"/>
+      <w:bookmarkStart w:id="13" w:name="lernziel"/>
       <w:r>
         <w:rPr>
           <w:sz w:val="22"/>
@@ -3093,7 +3041,7 @@
         </w:rPr>
         <w:t>Die Studierenden beherrschen die netzwerkübergreifende Kommunikation durch Adressierung, Routing und Flusssteuerung (End-to-End sowie Node-to-Node)</w:t>
       </w:r>
-      <w:bookmarkEnd w:id="15"/>
+      <w:bookmarkEnd w:id="13"/>
     </w:p>
     <w:p>
       <w:pPr>
@@ -3209,7 +3157,7 @@
           <w:szCs w:val="22"/>
         </w:rPr>
       </w:pPr>
-      <w:bookmarkStart w:id="16" w:name="formulierte-frage"/>
+      <w:bookmarkStart w:id="14" w:name="formulierte-frage"/>
       <w:r>
         <w:rPr>
           <w:sz w:val="22"/>
@@ -3217,7 +3165,7 @@
         </w:rPr>
         <w:t>Routing (Falsch)</w:t>
       </w:r>
-      <w:bookmarkEnd w:id="16"/>
+      <w:bookmarkEnd w:id="14"/>
     </w:p>
     <w:p>
       <w:pPr>
@@ -3370,8 +3318,8 @@
           <w:szCs w:val="22"/>
         </w:rPr>
       </w:pPr>
-      <w:bookmarkStart w:id="17" w:name="quelltext"/>
-      <w:bookmarkStart w:id="18" w:name="multiple-choice-question"/>
+      <w:bookmarkStart w:id="15" w:name="multiple-choice-question"/>
+      <w:bookmarkStart w:id="16" w:name="quelltext"/>
       <w:r>
         <w:rPr>
           <w:sz w:val="22"/>
@@ -3379,8 +3327,8 @@
         </w:rPr>
         <w:t>Strategien, wenn zu schnell gesendet wird. End-to-End: Vom Sender zum weit entfernten Empfänger. Node-to-Node: Von jedem Knoten zum Nächsten.</w:t>
       </w:r>
-      <w:bookmarkEnd w:id="17"/>
-      <w:bookmarkEnd w:id="18"/>
+      <w:bookmarkEnd w:id="15"/>
+      <w:bookmarkEnd w:id="16"/>
     </w:p>
     <w:p>
       <w:pPr>
@@ -4738,7 +4686,7 @@
           <w:szCs w:val="22"/>
         </w:rPr>
       </w:pPr>
-      <w:bookmarkStart w:id="19" w:name="lernziel_Copy_1"/>
+      <w:bookmarkStart w:id="17" w:name="lernziel_Copy_1"/>
       <w:r>
         <w:rPr>
           <w:sz w:val="22"/>
@@ -4746,7 +4694,7 @@
         </w:rPr>
         <w:t>Die Studierenden beherrschen die Mechanismen zur fehlergesicherten Datenübertragung, einschließlich Fehlerkontrolle, Flusskontrolle, Segmentierung, Identifikation und Medienzugriff</w:t>
       </w:r>
-      <w:bookmarkEnd w:id="19"/>
+      <w:bookmarkEnd w:id="17"/>
     </w:p>
     <w:p>
       <w:pPr>
@@ -4782,7 +4730,7 @@
           <w:szCs w:val="22"/>
         </w:rPr>
       </w:pPr>
-      <w:bookmarkStart w:id="20" w:name="formulierte-frage_Copy_1"/>
+      <w:bookmarkStart w:id="18" w:name="formulierte-frage_Copy_1"/>
       <w:r>
         <w:rPr>
           <w:sz w:val="22"/>
@@ -4790,7 +4738,7 @@
         </w:rPr>
         <w:t>Antwort: Das Konzept priorisiert minimale Aktivitätsdauer (Duty Cycling) und niedrigen Overhead. Fehlerkontrolle: Leichte Fehlererkennung via CRC, bei Fehlern verwerfen (keine Retransmission, falls Applikation tolerierbar). Flusskontrolle: Stop-and-Wait, um Puffer zu sparen und Senderrate anzupassen. Segmentierung: Feste, kleine Rahmen (z.B. 64 Byte) mit minimalem Header, um Übertragungszeit und Fehlerwahrscheinlichkeit gering zu halten. Identifikation: Kurze, lokale Cluster-Adressen (2 Byte) statt globaler Adressen. Medienzugriff: TDMA-basiert mit vorab zugeteilten Zeitschlitzen; Knoten schlafen außerhalb ihrer Sende-/Empfangsfenster. Dies minimiert Listening, Kollisionen und Overhead, und integriert alle Aufgaben energieeffizient. (Richtig)</w:t>
       </w:r>
-      <w:bookmarkEnd w:id="20"/>
+      <w:bookmarkEnd w:id="18"/>
     </w:p>
     <w:p>
       <w:pPr>
@@ -5022,8 +4970,8 @@
           <w:szCs w:val="22"/>
         </w:rPr>
       </w:pPr>
-      <w:bookmarkStart w:id="21" w:name="quelltext_Copy_1"/>
-      <w:bookmarkStart w:id="22" w:name="open-ended-question"/>
+      <w:bookmarkStart w:id="19" w:name="open-ended-question"/>
+      <w:bookmarkStart w:id="20" w:name="quelltext_Copy_1"/>
       <w:r>
         <w:rPr>
           <w:sz w:val="22"/>
@@ -5031,8 +4979,8 @@
         </w:rPr>
         <w:t>Aktivieren des Physical Layer. 4 typische Aspekte: Senden, Warten, Beheben und Reservieren.</w:t>
       </w:r>
-      <w:bookmarkEnd w:id="21"/>
-      <w:bookmarkEnd w:id="22"/>
+      <w:bookmarkEnd w:id="19"/>
+      <w:bookmarkEnd w:id="20"/>
     </w:p>
     <w:p>
       <w:pPr>
@@ -6096,6 +6044,142 @@
   </w:abstractNum>
   <w:abstractNum w:abstractNumId="2">
     <w:lvl w:ilvl="0">
+      <w:numFmt w:val="bullet"/>
+      <w:lvlText w:val=""/>
+      <w:lvlJc w:val="start"/>
+      <w:pPr>
+        <w:tabs>
+          <w:tab w:val="num" w:pos="0"/>
+        </w:tabs>
+        <w:ind w:start="720" w:hanging="360"/>
+      </w:pPr>
+      <w:rPr>
+        <w:rFonts w:ascii="Symbol" w:hAnsi="Symbol" w:cs="Symbol" w:hint="default"/>
+      </w:rPr>
+    </w:lvl>
+    <w:lvl w:ilvl="1">
+      <w:start w:val="0"/>
+      <w:numFmt w:val="bullet"/>
+      <w:lvlText w:val="o"/>
+      <w:lvlJc w:val="start"/>
+      <w:pPr>
+        <w:tabs>
+          <w:tab w:val="num" w:pos="0"/>
+        </w:tabs>
+        <w:ind w:start="1440" w:hanging="360"/>
+      </w:pPr>
+      <w:rPr>
+        <w:rFonts w:ascii="Courier New" w:hAnsi="Courier New" w:cs="Courier New" w:hint="default"/>
+      </w:rPr>
+    </w:lvl>
+    <w:lvl w:ilvl="2">
+      <w:start w:val="0"/>
+      <w:numFmt w:val="bullet"/>
+      <w:lvlText w:val=""/>
+      <w:lvlJc w:val="start"/>
+      <w:pPr>
+        <w:tabs>
+          <w:tab w:val="num" w:pos="0"/>
+        </w:tabs>
+        <w:ind w:start="2160" w:hanging="360"/>
+      </w:pPr>
+      <w:rPr>
+        <w:rFonts w:ascii="Wingdings" w:hAnsi="Wingdings" w:cs="Wingdings" w:hint="default"/>
+      </w:rPr>
+    </w:lvl>
+    <w:lvl w:ilvl="3">
+      <w:start w:val="0"/>
+      <w:numFmt w:val="bullet"/>
+      <w:lvlText w:val=""/>
+      <w:lvlJc w:val="start"/>
+      <w:pPr>
+        <w:tabs>
+          <w:tab w:val="num" w:pos="0"/>
+        </w:tabs>
+        <w:ind w:start="2880" w:hanging="360"/>
+      </w:pPr>
+      <w:rPr>
+        <w:rFonts w:ascii="Symbol" w:hAnsi="Symbol" w:cs="Symbol" w:hint="default"/>
+      </w:rPr>
+    </w:lvl>
+    <w:lvl w:ilvl="4">
+      <w:start w:val="0"/>
+      <w:numFmt w:val="bullet"/>
+      <w:lvlText w:val="o"/>
+      <w:lvlJc w:val="start"/>
+      <w:pPr>
+        <w:tabs>
+          <w:tab w:val="num" w:pos="0"/>
+        </w:tabs>
+        <w:ind w:start="3600" w:hanging="360"/>
+      </w:pPr>
+      <w:rPr>
+        <w:rFonts w:ascii="Courier New" w:hAnsi="Courier New" w:cs="Courier New" w:hint="default"/>
+      </w:rPr>
+    </w:lvl>
+    <w:lvl w:ilvl="5">
+      <w:start w:val="0"/>
+      <w:numFmt w:val="bullet"/>
+      <w:lvlText w:val=""/>
+      <w:lvlJc w:val="start"/>
+      <w:pPr>
+        <w:tabs>
+          <w:tab w:val="num" w:pos="0"/>
+        </w:tabs>
+        <w:ind w:start="4320" w:hanging="360"/>
+      </w:pPr>
+      <w:rPr>
+        <w:rFonts w:ascii="Wingdings" w:hAnsi="Wingdings" w:cs="Wingdings" w:hint="default"/>
+      </w:rPr>
+    </w:lvl>
+    <w:lvl w:ilvl="6">
+      <w:start w:val="0"/>
+      <w:numFmt w:val="bullet"/>
+      <w:lvlText w:val=""/>
+      <w:lvlJc w:val="start"/>
+      <w:pPr>
+        <w:tabs>
+          <w:tab w:val="num" w:pos="0"/>
+        </w:tabs>
+        <w:ind w:start="5040" w:hanging="360"/>
+      </w:pPr>
+      <w:rPr>
+        <w:rFonts w:ascii="Symbol" w:hAnsi="Symbol" w:cs="Symbol" w:hint="default"/>
+      </w:rPr>
+    </w:lvl>
+    <w:lvl w:ilvl="7">
+      <w:start w:val="0"/>
+      <w:numFmt w:val="bullet"/>
+      <w:lvlText w:val="o"/>
+      <w:lvlJc w:val="start"/>
+      <w:pPr>
+        <w:tabs>
+          <w:tab w:val="num" w:pos="0"/>
+        </w:tabs>
+        <w:ind w:start="5760" w:hanging="360"/>
+      </w:pPr>
+      <w:rPr>
+        <w:rFonts w:ascii="Courier New" w:hAnsi="Courier New" w:cs="Courier New" w:hint="default"/>
+      </w:rPr>
+    </w:lvl>
+    <w:lvl w:ilvl="8">
+      <w:start w:val="0"/>
+      <w:numFmt w:val="bullet"/>
+      <w:lvlText w:val=""/>
+      <w:lvlJc w:val="start"/>
+      <w:pPr>
+        <w:tabs>
+          <w:tab w:val="num" w:pos="0"/>
+        </w:tabs>
+        <w:ind w:start="6480" w:hanging="360"/>
+      </w:pPr>
+      <w:rPr>
+        <w:rFonts w:ascii="Wingdings" w:hAnsi="Wingdings" w:cs="Wingdings" w:hint="default"/>
+      </w:rPr>
+    </w:lvl>
+  </w:abstractNum>
+  <w:abstractNum w:abstractNumId="3">
+    <w:lvl w:ilvl="0">
       <w:start w:val="1"/>
       <w:numFmt w:val="decimal"/>
       <w:lvlText w:val="%1."/>
@@ -6213,7 +6297,7 @@
       <w:rPr/>
     </w:lvl>
   </w:abstractNum>
-  <w:abstractNum w:abstractNumId="3">
+  <w:abstractNum w:abstractNumId="4">
     <w:lvl w:ilvl="0">
       <w:start w:val="1"/>
       <w:numFmt w:val="lowerLetter"/>
@@ -6347,142 +6431,6 @@
       </w:pPr>
       <w:rPr>
         <w:rFonts w:cs="Wingdings"/>
-      </w:rPr>
-    </w:lvl>
-  </w:abstractNum>
-  <w:abstractNum w:abstractNumId="4">
-    <w:lvl w:ilvl="0">
-      <w:numFmt w:val="bullet"/>
-      <w:lvlText w:val=""/>
-      <w:lvlJc w:val="start"/>
-      <w:pPr>
-        <w:tabs>
-          <w:tab w:val="num" w:pos="0"/>
-        </w:tabs>
-        <w:ind w:start="720" w:hanging="360"/>
-      </w:pPr>
-      <w:rPr>
-        <w:rFonts w:ascii="Symbol" w:hAnsi="Symbol" w:cs="Symbol" w:hint="default"/>
-      </w:rPr>
-    </w:lvl>
-    <w:lvl w:ilvl="1">
-      <w:start w:val="0"/>
-      <w:numFmt w:val="bullet"/>
-      <w:lvlText w:val="o"/>
-      <w:lvlJc w:val="start"/>
-      <w:pPr>
-        <w:tabs>
-          <w:tab w:val="num" w:pos="0"/>
-        </w:tabs>
-        <w:ind w:start="1440" w:hanging="360"/>
-      </w:pPr>
-      <w:rPr>
-        <w:rFonts w:ascii="Courier New" w:hAnsi="Courier New" w:cs="Courier New" w:hint="default"/>
-      </w:rPr>
-    </w:lvl>
-    <w:lvl w:ilvl="2">
-      <w:start w:val="0"/>
-      <w:numFmt w:val="bullet"/>
-      <w:lvlText w:val=""/>
-      <w:lvlJc w:val="start"/>
-      <w:pPr>
-        <w:tabs>
-          <w:tab w:val="num" w:pos="0"/>
-        </w:tabs>
-        <w:ind w:start="2160" w:hanging="360"/>
-      </w:pPr>
-      <w:rPr>
-        <w:rFonts w:ascii="Wingdings" w:hAnsi="Wingdings" w:cs="Wingdings" w:hint="default"/>
-      </w:rPr>
-    </w:lvl>
-    <w:lvl w:ilvl="3">
-      <w:start w:val="0"/>
-      <w:numFmt w:val="bullet"/>
-      <w:lvlText w:val=""/>
-      <w:lvlJc w:val="start"/>
-      <w:pPr>
-        <w:tabs>
-          <w:tab w:val="num" w:pos="0"/>
-        </w:tabs>
-        <w:ind w:start="2880" w:hanging="360"/>
-      </w:pPr>
-      <w:rPr>
-        <w:rFonts w:ascii="Symbol" w:hAnsi="Symbol" w:cs="Symbol" w:hint="default"/>
-      </w:rPr>
-    </w:lvl>
-    <w:lvl w:ilvl="4">
-      <w:start w:val="0"/>
-      <w:numFmt w:val="bullet"/>
-      <w:lvlText w:val="o"/>
-      <w:lvlJc w:val="start"/>
-      <w:pPr>
-        <w:tabs>
-          <w:tab w:val="num" w:pos="0"/>
-        </w:tabs>
-        <w:ind w:start="3600" w:hanging="360"/>
-      </w:pPr>
-      <w:rPr>
-        <w:rFonts w:ascii="Courier New" w:hAnsi="Courier New" w:cs="Courier New" w:hint="default"/>
-      </w:rPr>
-    </w:lvl>
-    <w:lvl w:ilvl="5">
-      <w:start w:val="0"/>
-      <w:numFmt w:val="bullet"/>
-      <w:lvlText w:val=""/>
-      <w:lvlJc w:val="start"/>
-      <w:pPr>
-        <w:tabs>
-          <w:tab w:val="num" w:pos="0"/>
-        </w:tabs>
-        <w:ind w:start="4320" w:hanging="360"/>
-      </w:pPr>
-      <w:rPr>
-        <w:rFonts w:ascii="Wingdings" w:hAnsi="Wingdings" w:cs="Wingdings" w:hint="default"/>
-      </w:rPr>
-    </w:lvl>
-    <w:lvl w:ilvl="6">
-      <w:start w:val="0"/>
-      <w:numFmt w:val="bullet"/>
-      <w:lvlText w:val=""/>
-      <w:lvlJc w:val="start"/>
-      <w:pPr>
-        <w:tabs>
-          <w:tab w:val="num" w:pos="0"/>
-        </w:tabs>
-        <w:ind w:start="5040" w:hanging="360"/>
-      </w:pPr>
-      <w:rPr>
-        <w:rFonts w:ascii="Symbol" w:hAnsi="Symbol" w:cs="Symbol" w:hint="default"/>
-      </w:rPr>
-    </w:lvl>
-    <w:lvl w:ilvl="7">
-      <w:start w:val="0"/>
-      <w:numFmt w:val="bullet"/>
-      <w:lvlText w:val="o"/>
-      <w:lvlJc w:val="start"/>
-      <w:pPr>
-        <w:tabs>
-          <w:tab w:val="num" w:pos="0"/>
-        </w:tabs>
-        <w:ind w:start="5760" w:hanging="360"/>
-      </w:pPr>
-      <w:rPr>
-        <w:rFonts w:ascii="Courier New" w:hAnsi="Courier New" w:cs="Courier New" w:hint="default"/>
-      </w:rPr>
-    </w:lvl>
-    <w:lvl w:ilvl="8">
-      <w:start w:val="0"/>
-      <w:numFmt w:val="bullet"/>
-      <w:lvlText w:val=""/>
-      <w:lvlJc w:val="start"/>
-      <w:pPr>
-        <w:tabs>
-          <w:tab w:val="num" w:pos="0"/>
-        </w:tabs>
-        <w:ind w:start="6480" w:hanging="360"/>
-      </w:pPr>
-      <w:rPr>
-        <w:rFonts w:ascii="Wingdings" w:hAnsi="Wingdings" w:cs="Wingdings" w:hint="default"/>
       </w:rPr>
     </w:lvl>
   </w:abstractNum>
@@ -7110,37 +7058,37 @@
         <a:srgbClr val="000000"/>
       </a:dk1>
       <a:lt1>
-        <a:srgbClr val="ffffff"/>
+        <a:srgbClr val="FFFFFF"/>
       </a:lt1>
       <a:dk2>
         <a:srgbClr val="000000"/>
       </a:dk2>
       <a:lt2>
-        <a:srgbClr val="ffffff"/>
+        <a:srgbClr val="FFFFFF"/>
       </a:lt2>
       <a:accent1>
-        <a:srgbClr val="18a303"/>
+        <a:srgbClr val="18A303"/>
       </a:accent1>
       <a:accent2>
-        <a:srgbClr val="0369a3"/>
+        <a:srgbClr val="0369A3"/>
       </a:accent2>
       <a:accent3>
-        <a:srgbClr val="a33e03"/>
+        <a:srgbClr val="A33E03"/>
       </a:accent3>
       <a:accent4>
-        <a:srgbClr val="8e03a3"/>
+        <a:srgbClr val="8E03A3"/>
       </a:accent4>
       <a:accent5>
-        <a:srgbClr val="c99c00"/>
+        <a:srgbClr val="C99C00"/>
       </a:accent5>
       <a:accent6>
-        <a:srgbClr val="c9211e"/>
+        <a:srgbClr val="C9211E"/>
       </a:accent6>
       <a:hlink>
-        <a:srgbClr val="0000ee"/>
+        <a:srgbClr val="0000EE"/>
       </a:hlink>
       <a:folHlink>
-        <a:srgbClr val="551a8b"/>
+        <a:srgbClr val="551A8B"/>
       </a:folHlink>
     </a:clrScheme>
     <a:fontScheme name="Office">

</xml_diff>